<commit_message>
Actualización de la metodología del proyecto a Kanban y ajustes en la documentación del desarrollo del sistema UrbanLink.
</commit_message>
<xml_diff>
--- a/FASE 2/Evidencia Grupal/2.4_GuiaEstudiante_Fase 2_DesarrolloProyecto APT.docx
+++ b/FASE 2/Evidencia Grupal/2.4_GuiaEstudiante_Fase 2_DesarrolloProyecto APT.docx
@@ -527,7 +527,7 @@
     <w:tbl>
       <w:tblPr>
         <w:tblStyle w:val="Table2"/>
-        <w:tblW w:w="9639.0" w:type="dxa"/>
+        <w:tblW w:w="9645.0" w:type="dxa"/>
         <w:jc w:val="left"/>
         <w:tblInd w:w="-572.0" w:type="dxa"/>
         <w:tblBorders>
@@ -542,12 +542,12 @@
         <w:tblLook w:val="0400"/>
       </w:tblPr>
       <w:tblGrid>
-        <w:gridCol w:w="2528"/>
-        <w:gridCol w:w="7111"/>
+        <w:gridCol w:w="2025"/>
+        <w:gridCol w:w="7620"/>
         <w:tblGridChange w:id="0">
           <w:tblGrid>
-            <w:gridCol w:w="2528"/>
-            <w:gridCol w:w="7111"/>
+            <w:gridCol w:w="2025"/>
+            <w:gridCol w:w="7620"/>
           </w:tblGrid>
         </w:tblGridChange>
       </w:tblGrid>
@@ -563,13 +563,13 @@
           <w:p>
             <w:pPr>
               <w:rPr>
-                <w:rFonts w:ascii="Calibri" w:cs="Calibri" w:eastAsia="Calibri" w:hAnsi="Calibri"/>
+                <w:rFonts w:ascii="Arial" w:cs="Arial" w:eastAsia="Arial" w:hAnsi="Arial"/>
                 <w:color w:val="1f3864"/>
               </w:rPr>
             </w:pPr>
             <w:r>
               <w:rPr>
-                <w:rFonts w:ascii="Calibri" w:cs="Calibri" w:eastAsia="Calibri" w:hAnsi="Calibri"/>
+                <w:rFonts w:ascii="Arial" w:cs="Arial" w:eastAsia="Arial" w:hAnsi="Arial"/>
                 <w:color w:val="1f3864"/>
                 <w:rtl w:val="0"/>
               </w:rPr>
@@ -583,12 +583,14 @@
             <w:pPr>
               <w:jc w:val="both"/>
               <w:rPr>
+                <w:rFonts w:ascii="Arial" w:cs="Arial" w:eastAsia="Arial" w:hAnsi="Arial"/>
                 <w:sz w:val="20"/>
                 <w:szCs w:val="20"/>
               </w:rPr>
             </w:pPr>
             <w:r>
               <w:rPr>
+                <w:rFonts w:ascii="Arial" w:cs="Arial" w:eastAsia="Arial" w:hAnsi="Arial"/>
                 <w:sz w:val="20"/>
                 <w:szCs w:val="20"/>
                 <w:rtl w:val="0"/>
@@ -600,12 +602,14 @@
             <w:pPr>
               <w:jc w:val="both"/>
               <w:rPr>
+                <w:rFonts w:ascii="Arial" w:cs="Arial" w:eastAsia="Arial" w:hAnsi="Arial"/>
                 <w:sz w:val="20"/>
                 <w:szCs w:val="20"/>
               </w:rPr>
             </w:pPr>
             <w:r>
               <w:rPr>
+                <w:rFonts w:ascii="Arial" w:cs="Arial" w:eastAsia="Arial" w:hAnsi="Arial"/>
                 <w:sz w:val="20"/>
                 <w:szCs w:val="20"/>
                 <w:rtl w:val="0"/>
@@ -617,12 +621,14 @@
             <w:pPr>
               <w:jc w:val="both"/>
               <w:rPr>
+                <w:rFonts w:ascii="Arial" w:cs="Arial" w:eastAsia="Arial" w:hAnsi="Arial"/>
                 <w:sz w:val="20"/>
                 <w:szCs w:val="20"/>
               </w:rPr>
             </w:pPr>
             <w:r>
               <w:rPr>
+                <w:rFonts w:ascii="Arial" w:cs="Arial" w:eastAsia="Arial" w:hAnsi="Arial"/>
                 <w:sz w:val="20"/>
                 <w:szCs w:val="20"/>
                 <w:rtl w:val="0"/>
@@ -634,12 +640,14 @@
             <w:pPr>
               <w:jc w:val="both"/>
               <w:rPr>
+                <w:rFonts w:ascii="Arial" w:cs="Arial" w:eastAsia="Arial" w:hAnsi="Arial"/>
                 <w:sz w:val="20"/>
                 <w:szCs w:val="20"/>
               </w:rPr>
             </w:pPr>
             <w:r>
               <w:rPr>
+                <w:rFonts w:ascii="Arial" w:cs="Arial" w:eastAsia="Arial" w:hAnsi="Arial"/>
                 <w:sz w:val="20"/>
                 <w:szCs w:val="20"/>
                 <w:rtl w:val="0"/>
@@ -651,12 +659,14 @@
             <w:pPr>
               <w:jc w:val="both"/>
               <w:rPr>
+                <w:rFonts w:ascii="Arial" w:cs="Arial" w:eastAsia="Arial" w:hAnsi="Arial"/>
                 <w:sz w:val="20"/>
                 <w:szCs w:val="20"/>
               </w:rPr>
             </w:pPr>
             <w:r>
               <w:rPr>
+                <w:rFonts w:ascii="Arial" w:cs="Arial" w:eastAsia="Arial" w:hAnsi="Arial"/>
                 <w:sz w:val="20"/>
                 <w:szCs w:val="20"/>
                 <w:rtl w:val="0"/>
@@ -684,13 +694,13 @@
           <w:p>
             <w:pPr>
               <w:rPr>
-                <w:rFonts w:ascii="Calibri" w:cs="Calibri" w:eastAsia="Calibri" w:hAnsi="Calibri"/>
+                <w:rFonts w:ascii="Arial" w:cs="Arial" w:eastAsia="Arial" w:hAnsi="Arial"/>
                 <w:color w:val="1f3864"/>
               </w:rPr>
             </w:pPr>
             <w:r>
               <w:rPr>
-                <w:rFonts w:ascii="Calibri" w:cs="Calibri" w:eastAsia="Calibri" w:hAnsi="Calibri"/>
+                <w:rFonts w:ascii="Arial" w:cs="Arial" w:eastAsia="Arial" w:hAnsi="Arial"/>
                 <w:color w:val="1f3864"/>
                 <w:rtl w:val="0"/>
               </w:rPr>
@@ -706,12 +716,14 @@
             <w:pPr>
               <w:jc w:val="both"/>
               <w:rPr>
+                <w:rFonts w:ascii="Arial" w:cs="Arial" w:eastAsia="Arial" w:hAnsi="Arial"/>
                 <w:sz w:val="20"/>
                 <w:szCs w:val="20"/>
               </w:rPr>
             </w:pPr>
             <w:r>
               <w:rPr>
+                <w:rFonts w:ascii="Arial" w:cs="Arial" w:eastAsia="Arial" w:hAnsi="Arial"/>
                 <w:sz w:val="20"/>
                 <w:szCs w:val="20"/>
                 <w:rtl w:val="0"/>
@@ -729,7 +741,7 @@
       <w:tr>
         <w:trPr>
           <w:cantSplit w:val="0"/>
-          <w:trHeight w:val="939" w:hRule="atLeast"/>
+          <w:trHeight w:val="2475.089518229165" w:hRule="atLeast"/>
           <w:tblHeader w:val="0"/>
         </w:trPr>
         <w:tc>
@@ -739,13 +751,13 @@
           <w:p>
             <w:pPr>
               <w:rPr>
-                <w:rFonts w:ascii="Calibri" w:cs="Calibri" w:eastAsia="Calibri" w:hAnsi="Calibri"/>
+                <w:rFonts w:ascii="Arial" w:cs="Arial" w:eastAsia="Arial" w:hAnsi="Arial"/>
                 <w:color w:val="1f3864"/>
               </w:rPr>
             </w:pPr>
             <w:r>
               <w:rPr>
-                <w:rFonts w:ascii="Calibri" w:cs="Calibri" w:eastAsia="Calibri" w:hAnsi="Calibri"/>
+                <w:rFonts w:ascii="Arial" w:cs="Arial" w:eastAsia="Arial" w:hAnsi="Arial"/>
                 <w:color w:val="1f3864"/>
                 <w:rtl w:val="0"/>
               </w:rPr>
@@ -761,51 +773,76 @@
             <w:pPr>
               <w:jc w:val="both"/>
               <w:rPr>
+                <w:rFonts w:ascii="Arial" w:cs="Arial" w:eastAsia="Arial" w:hAnsi="Arial"/>
                 <w:sz w:val="20"/>
                 <w:szCs w:val="20"/>
               </w:rPr>
             </w:pPr>
             <w:r>
               <w:rPr>
+                <w:rFonts w:ascii="Arial" w:cs="Arial" w:eastAsia="Arial" w:hAnsi="Arial"/>
                 <w:sz w:val="20"/>
                 <w:szCs w:val="20"/>
                 <w:rtl w:val="0"/>
               </w:rPr>
-              <w:t xml:space="preserve">Para el desarrollo del proyecto se utilizó una metodología orientada al análisis, planificación y diseño progresivo del sistema. Durante esta fase se trabajó principalmente en la organización de requerimientos, diseño de arquitectura y estructura de base de datos.</w:t>
+              <w:t xml:space="preserve">Para el desarrollo del proyecto “UrbanLink” se está utilizando la metodología Kanban, la cual permite organizar y controlar las actividades del equipo de manera visual y progresiva.</w:t>
             </w:r>
           </w:p>
           <w:p>
             <w:pPr>
               <w:jc w:val="both"/>
               <w:rPr>
+                <w:rFonts w:ascii="Arial" w:cs="Arial" w:eastAsia="Arial" w:hAnsi="Arial"/>
                 <w:sz w:val="20"/>
                 <w:szCs w:val="20"/>
               </w:rPr>
             </w:pPr>
             <w:r>
               <w:rPr>
+                <w:rFonts w:ascii="Arial" w:cs="Arial" w:eastAsia="Arial" w:hAnsi="Arial"/>
                 <w:sz w:val="20"/>
                 <w:szCs w:val="20"/>
                 <w:rtl w:val="0"/>
               </w:rPr>
-              <w:t xml:space="preserve">Se utilizaron herramientas como Oracle SQL Developer Data Modeler para la creación del modelo relacional, Draw.io para el diseño de diagramas C4 y Supabase como plataforma backend para la futura implementación del sistema.</w:t>
+              <w:t xml:space="preserve">Esta metodología se basa en la división de tareas en diferentes estados de avance, permitiendo identificar actividades pendientes, en desarrollo y completadas. Gracias a esto, el equipo puede mantener un mejor control sobre el progreso del proyecto y organizar de manera más eficiente las tareas asignadas a cada integrante.</w:t>
             </w:r>
           </w:p>
           <w:p>
             <w:pPr>
               <w:jc w:val="both"/>
               <w:rPr>
+                <w:rFonts w:ascii="Arial" w:cs="Arial" w:eastAsia="Arial" w:hAnsi="Arial"/>
                 <w:sz w:val="20"/>
                 <w:szCs w:val="20"/>
               </w:rPr>
             </w:pPr>
             <w:r>
               <w:rPr>
+                <w:rFonts w:ascii="Arial" w:cs="Arial" w:eastAsia="Arial" w:hAnsi="Arial"/>
                 <w:sz w:val="20"/>
                 <w:szCs w:val="20"/>
                 <w:rtl w:val="0"/>
               </w:rPr>
-              <w:t xml:space="preserve">Además, se realizaron revisiones y correcciones constantes en función de la retroalimentación obtenida durante el desarrollo del proyecto, permitiendo mejorar la estructura y organización de la solución propuesta.</w:t>
+              <w:t xml:space="preserve">Durante esta fase del proyecto, Kanban permitió gestionar actividades relacionadas con el análisis del sistema, diseño del modelo relacional, elaboración de diagramas C4 y definición de funcionalidades principales de la plataforma.</w:t>
+            </w:r>
+          </w:p>
+          <w:p>
+            <w:pPr>
+              <w:jc w:val="both"/>
+              <w:rPr>
+                <w:rFonts w:ascii="Arial" w:cs="Arial" w:eastAsia="Arial" w:hAnsi="Arial"/>
+                <w:sz w:val="20"/>
+                <w:szCs w:val="20"/>
+              </w:rPr>
+            </w:pPr>
+            <w:r>
+              <w:rPr>
+                <w:rFonts w:ascii="Arial" w:cs="Arial" w:eastAsia="Arial" w:hAnsi="Arial"/>
+                <w:sz w:val="20"/>
+                <w:szCs w:val="20"/>
+                <w:rtl w:val="0"/>
+              </w:rPr>
+              <w:t xml:space="preserve">Además, se realizaron revisiones y ajustes continuos a medida que avanzaba el desarrollo, considerando observaciones y retroalimentación docente para mejorar la estructura del sistema y la organización de la información.</w:t>
             </w:r>
             <w:r>
               <w:rPr>
@@ -828,13 +865,13 @@
           <w:p>
             <w:pPr>
               <w:rPr>
-                <w:rFonts w:ascii="Calibri" w:cs="Calibri" w:eastAsia="Calibri" w:hAnsi="Calibri"/>
+                <w:rFonts w:ascii="Arial" w:cs="Arial" w:eastAsia="Arial" w:hAnsi="Arial"/>
                 <w:color w:val="1f3864"/>
               </w:rPr>
             </w:pPr>
             <w:r>
               <w:rPr>
-                <w:rFonts w:ascii="Calibri" w:cs="Calibri" w:eastAsia="Calibri" w:hAnsi="Calibri"/>
+                <w:rFonts w:ascii="Arial" w:cs="Arial" w:eastAsia="Arial" w:hAnsi="Arial"/>
                 <w:color w:val="1f3864"/>
                 <w:rtl w:val="0"/>
               </w:rPr>
@@ -850,77 +887,263 @@
             <w:pPr>
               <w:jc w:val="both"/>
               <w:rPr>
-                <w:rFonts w:ascii="Calibri" w:cs="Calibri" w:eastAsia="Calibri" w:hAnsi="Calibri"/>
-                <w:i w:val="1"/>
-                <w:iCs w:val="1"/>
-                <w:color w:val="548dd4"/>
+                <w:rFonts w:ascii="Arial" w:cs="Arial" w:eastAsia="Arial" w:hAnsi="Arial"/>
                 <w:sz w:val="20"/>
                 <w:szCs w:val="20"/>
               </w:rPr>
             </w:pPr>
-            <w:r>
-              <w:rPr>
-                <w:rFonts w:ascii="Calibri" w:cs="Calibri" w:eastAsia="Calibri" w:hAnsi="Calibri"/>
-                <w:i w:val="1"/>
-                <w:iCs w:val="1"/>
-                <w:color w:val="548dd4"/>
-                <w:sz w:val="20"/>
-                <w:szCs w:val="20"/>
-                <w:rtl w:val="0"/>
-              </w:rPr>
-              <w:t xml:space="preserve">Describe la(s) evidencia(s) que presentarás en este informe de avance y justifica de qué manera esta(s) evidencia(s) permite(n) dar cuenta del desarrollo del proyecto.</w:t>
+            <w:hyperlink r:id="rId9">
+              <w:r>
+                <w:rPr>
+                  <w:rFonts w:ascii="Arial" w:cs="Arial" w:eastAsia="Arial" w:hAnsi="Arial"/>
+                  <w:b w:val="1"/>
+                  <w:bCs w:val="1"/>
+                  <w:color w:val="1155cc"/>
+                  <w:sz w:val="24"/>
+                  <w:szCs w:val="24"/>
+                  <w:rtl w:val="0"/>
+                </w:rPr>
+                <w:t xml:space="preserve">Tablero Kanban</w:t>
+              </w:r>
+            </w:hyperlink>
+            <w:r>
+              <w:rPr>
+                <w:rtl w:val="0"/>
+              </w:rPr>
             </w:r>
           </w:p>
           <w:p>
             <w:pPr>
               <w:jc w:val="both"/>
               <w:rPr>
-                <w:rFonts w:ascii="Calibri" w:cs="Calibri" w:eastAsia="Calibri" w:hAnsi="Calibri"/>
-                <w:i w:val="1"/>
-                <w:iCs w:val="1"/>
-                <w:color w:val="548dd4"/>
+                <w:rFonts w:ascii="Arial" w:cs="Arial" w:eastAsia="Arial" w:hAnsi="Arial"/>
                 <w:sz w:val="20"/>
                 <w:szCs w:val="20"/>
               </w:rPr>
             </w:pPr>
             <w:r>
               <w:rPr>
-                <w:rFonts w:ascii="Calibri" w:cs="Calibri" w:eastAsia="Calibri" w:hAnsi="Calibri"/>
-                <w:i w:val="1"/>
-                <w:iCs w:val="1"/>
-                <w:color w:val="548dd4"/>
+                <w:rFonts w:ascii="Arial" w:cs="Arial" w:eastAsia="Arial" w:hAnsi="Arial"/>
                 <w:sz w:val="20"/>
                 <w:szCs w:val="20"/>
                 <w:rtl w:val="0"/>
               </w:rPr>
-              <w:t xml:space="preserve">En caso de ser pertinente explica cómo resguardaste la calidad de tu Proyecto APT a partir de aspectos propios de tu disciplina (correcta aplicación de metodologías, actividades, herramientas, recursos propios, etc.).</w:t>
+              <w:t xml:space="preserve">Tablero Kanban que contiene la planificación y distribución de las tareas asignadas a los integrantes del equipo. Aquí se puede visualizar el avance del proyecto, la organización del trabajo colaborativo y el seguimiento de las actividades pendientes, en desarrollo y finalizadas. </w:t>
+            </w:r>
+          </w:p>
+          <w:p>
+            <w:pPr>
+              <w:ind w:left="0" w:firstLine="0"/>
+              <w:jc w:val="both"/>
+              <w:rPr>
+                <w:rFonts w:ascii="Arial" w:cs="Arial" w:eastAsia="Arial" w:hAnsi="Arial"/>
+                <w:b w:val="1"/>
+                <w:bCs w:val="1"/>
+                <w:color w:val="548dd4"/>
+                <w:sz w:val="24"/>
+                <w:szCs w:val="24"/>
+              </w:rPr>
+            </w:pPr>
+            <w:hyperlink r:id="rId10">
+              <w:r>
+                <w:rPr>
+                  <w:rFonts w:ascii="Arial" w:cs="Arial" w:eastAsia="Arial" w:hAnsi="Arial"/>
+                  <w:b w:val="1"/>
+                  <w:bCs w:val="1"/>
+                  <w:color w:val="1155cc"/>
+                  <w:sz w:val="24"/>
+                  <w:szCs w:val="24"/>
+                  <w:rtl w:val="0"/>
+                </w:rPr>
+                <w:t xml:space="preserve">Modelo Relacional</w:t>
+              </w:r>
+            </w:hyperlink>
+            <w:r>
+              <w:rPr>
+                <w:rtl w:val="0"/>
+              </w:rPr>
+            </w:r>
+          </w:p>
+          <w:p>
+            <w:pPr>
+              <w:ind w:left="0" w:firstLine="0"/>
+              <w:jc w:val="both"/>
+              <w:rPr>
+                <w:rFonts w:ascii="Arial" w:cs="Arial" w:eastAsia="Arial" w:hAnsi="Arial"/>
+                <w:color w:val="ff0000"/>
+                <w:sz w:val="20"/>
+                <w:szCs w:val="20"/>
+              </w:rPr>
+            </w:pPr>
+            <w:r>
+              <w:rPr>
+                <w:rFonts w:ascii="Arial" w:cs="Arial" w:eastAsia="Arial" w:hAnsi="Arial"/>
+                <w:sz w:val="20"/>
+                <w:szCs w:val="20"/>
+                <w:rtl w:val="0"/>
+              </w:rPr>
+              <w:t xml:space="preserve">Modelo relacional correspondiente al proyecto, el cual representa la estructura de la base de datos, las entidades involucradas y las relaciones existentes entre ellas.</w:t>
+            </w:r>
+            <w:r>
+              <w:rPr>
+                <w:rtl w:val="0"/>
+              </w:rPr>
             </w:r>
           </w:p>
           <w:p>
             <w:pPr>
               <w:jc w:val="both"/>
               <w:rPr>
-                <w:rFonts w:ascii="Calibri" w:cs="Calibri" w:eastAsia="Calibri" w:hAnsi="Calibri"/>
+                <w:rFonts w:ascii="Arial" w:cs="Arial" w:eastAsia="Arial" w:hAnsi="Arial"/>
                 <w:b w:val="1"/>
                 <w:bCs w:val="1"/>
-                <w:i w:val="1"/>
-                <w:iCs w:val="1"/>
                 <w:color w:val="548dd4"/>
+                <w:sz w:val="24"/>
+                <w:szCs w:val="24"/>
+              </w:rPr>
+            </w:pPr>
+            <w:hyperlink r:id="rId11">
+              <w:r>
+                <w:rPr>
+                  <w:rFonts w:ascii="Arial" w:cs="Arial" w:eastAsia="Arial" w:hAnsi="Arial"/>
+                  <w:b w:val="1"/>
+                  <w:bCs w:val="1"/>
+                  <w:color w:val="1155cc"/>
+                  <w:sz w:val="24"/>
+                  <w:szCs w:val="24"/>
+                  <w:rtl w:val="0"/>
+                </w:rPr>
+                <w:t xml:space="preserve">GitHub UrbanLink</w:t>
+              </w:r>
+            </w:hyperlink>
+            <w:r>
+              <w:rPr>
+                <w:rtl w:val="0"/>
+              </w:rPr>
+            </w:r>
+          </w:p>
+          <w:p>
+            <w:pPr>
+              <w:ind w:left="0" w:firstLine="0"/>
+              <w:jc w:val="both"/>
+              <w:rPr>
+                <w:rFonts w:ascii="Arial" w:cs="Arial" w:eastAsia="Arial" w:hAnsi="Arial"/>
                 <w:sz w:val="20"/>
                 <w:szCs w:val="20"/>
               </w:rPr>
             </w:pPr>
             <w:r>
               <w:rPr>
-                <w:rFonts w:ascii="Calibri" w:cs="Calibri" w:eastAsia="Calibri" w:hAnsi="Calibri"/>
-                <w:i w:val="1"/>
-                <w:iCs w:val="1"/>
-                <w:color w:val="548dd4"/>
+                <w:rFonts w:ascii="Arial" w:cs="Arial" w:eastAsia="Arial" w:hAnsi="Arial"/>
                 <w:sz w:val="20"/>
                 <w:szCs w:val="20"/>
                 <w:rtl w:val="0"/>
               </w:rPr>
-              <w:t xml:space="preserve">En este apartado adjuntar la(s) evidencia(s) seleccionada(s) para ser evaluada por el docente.</w:t>
+              <w:t xml:space="preserve">GitHub del proyecto UrbanLink, donde se almacenan los avances del desarrollo, control de versiones y colaboración entre los integrantes del equipo. Se puede demostrar el progreso técnico del proyecto y el registro de cambios realizados. </w:t>
+            </w:r>
+          </w:p>
+          <w:p>
+            <w:pPr>
+              <w:jc w:val="both"/>
+              <w:rPr>
+                <w:rFonts w:ascii="Arial" w:cs="Arial" w:eastAsia="Arial" w:hAnsi="Arial"/>
+                <w:b w:val="1"/>
+                <w:bCs w:val="1"/>
+                <w:color w:val="548dd4"/>
+                <w:sz w:val="24"/>
+                <w:szCs w:val="24"/>
+              </w:rPr>
+            </w:pPr>
+            <w:hyperlink r:id="rId12">
+              <w:r>
+                <w:rPr>
+                  <w:rFonts w:ascii="Arial" w:cs="Arial" w:eastAsia="Arial" w:hAnsi="Arial"/>
+                  <w:b w:val="1"/>
+                  <w:bCs w:val="1"/>
+                  <w:color w:val="1155cc"/>
+                  <w:sz w:val="24"/>
+                  <w:szCs w:val="24"/>
+                  <w:rtl w:val="0"/>
+                </w:rPr>
+                <w:t xml:space="preserve">Documento Definición Proyecto APT</w:t>
+              </w:r>
+            </w:hyperlink>
+            <w:r>
+              <w:rPr>
+                <w:rtl w:val="0"/>
+              </w:rPr>
+            </w:r>
+          </w:p>
+          <w:p>
+            <w:pPr>
+              <w:ind w:left="0" w:firstLine="0"/>
+              <w:jc w:val="both"/>
+              <w:rPr>
+                <w:rFonts w:ascii="Arial" w:cs="Arial" w:eastAsia="Arial" w:hAnsi="Arial"/>
+                <w:sz w:val="20"/>
+                <w:szCs w:val="20"/>
+              </w:rPr>
+            </w:pPr>
+            <w:r>
+              <w:rPr>
+                <w:rFonts w:ascii="Arial" w:cs="Arial" w:eastAsia="Arial" w:hAnsi="Arial"/>
+                <w:sz w:val="20"/>
+                <w:szCs w:val="20"/>
+                <w:rtl w:val="0"/>
+              </w:rPr>
+              <w:t xml:space="preserve">Este documento contiene los objetivos, alcance, requerimientos y planificación general del sistema. Esto permite comprender la orientación del proyecto y verificar que el desarrollo se encuentra alineado con los objetivos establecidos inicialmente. </w:t>
+            </w:r>
+          </w:p>
+          <w:p>
+            <w:pPr>
+              <w:jc w:val="both"/>
+              <w:rPr>
+                <w:rFonts w:ascii="Arial" w:cs="Arial" w:eastAsia="Arial" w:hAnsi="Arial"/>
+                <w:b w:val="1"/>
+                <w:bCs w:val="1"/>
+                <w:color w:val="548dd4"/>
+                <w:sz w:val="24"/>
+                <w:szCs w:val="24"/>
+              </w:rPr>
+            </w:pPr>
+            <w:hyperlink r:id="rId13">
+              <w:r>
+                <w:rPr>
+                  <w:rFonts w:ascii="Arial" w:cs="Arial" w:eastAsia="Arial" w:hAnsi="Arial"/>
+                  <w:b w:val="1"/>
+                  <w:bCs w:val="1"/>
+                  <w:color w:val="1155cc"/>
+                  <w:sz w:val="24"/>
+                  <w:szCs w:val="24"/>
+                  <w:rtl w:val="0"/>
+                </w:rPr>
+                <w:t xml:space="preserve">Arquitectura C4</w:t>
+              </w:r>
+            </w:hyperlink>
+            <w:r>
+              <w:rPr>
+                <w:rtl w:val="0"/>
+              </w:rPr>
+            </w:r>
+          </w:p>
+          <w:p>
+            <w:pPr>
+              <w:ind w:left="0" w:firstLine="0"/>
+              <w:jc w:val="both"/>
+              <w:rPr>
+                <w:rFonts w:ascii="Arial" w:cs="Arial" w:eastAsia="Arial" w:hAnsi="Arial"/>
+                <w:sz w:val="20"/>
+                <w:szCs w:val="20"/>
+              </w:rPr>
+            </w:pPr>
+            <w:r>
+              <w:rPr>
+                <w:rFonts w:ascii="Arial" w:cs="Arial" w:eastAsia="Arial" w:hAnsi="Arial"/>
+                <w:sz w:val="20"/>
+                <w:szCs w:val="20"/>
+                <w:rtl w:val="0"/>
+              </w:rPr>
+              <w:t xml:space="preserve">Permite visualizar los componentes principales, las relaciones entre ellos y la interacción con usuarios y sistemas externos, facilitando la comprensión de la arquitectura general del proyecto. </w:t>
             </w:r>
             <w:r>
               <w:rPr>
@@ -939,6 +1162,37 @@
           <w:szCs w:val="24"/>
         </w:rPr>
       </w:pPr>
+      <w:r>
+        <w:rPr>
+          <w:rtl w:val="0"/>
+        </w:rPr>
+      </w:r>
+    </w:p>
+    <w:p>
+      <w:pPr>
+        <w:rPr>
+          <w:color w:val="595959"/>
+          <w:sz w:val="24"/>
+          <w:szCs w:val="24"/>
+        </w:rPr>
+      </w:pPr>
+      <w:r>
+        <w:rPr>
+          <w:rtl w:val="0"/>
+        </w:rPr>
+      </w:r>
+    </w:p>
+    <w:p>
+      <w:pPr>
+        <w:rPr>
+          <w:color w:val="595959"/>
+          <w:sz w:val="24"/>
+          <w:szCs w:val="24"/>
+        </w:rPr>
+      </w:pPr>
+      <w:r>
+        <w:br w:type="page"/>
+      </w:r>
       <w:r>
         <w:rPr>
           <w:rtl w:val="0"/>
@@ -1094,15 +1348,15 @@
     <w:sdt>
       <w:sdtPr>
         <w:lock w:val="contentLocked"/>
-        <w:id w:val="382259917"/>
+        <w:id w:val="-1469132818"/>
         <w:tag w:val="goog_rdk_0"/>
       </w:sdtPr>
       <w:sdtContent>
         <w:tbl>
           <w:tblPr>
             <w:tblStyle w:val="Table4"/>
-            <w:tblpPr w:leftFromText="180" w:rightFromText="180" w:topFromText="0" w:bottomFromText="0" w:vertAnchor="page" w:horzAnchor="margin" w:tblpX="-635.9999999999999" w:tblpY="4605"/>
-            <w:tblW w:w="9776.000000000002" w:type="dxa"/>
+            <w:tblpPr w:leftFromText="180" w:rightFromText="180" w:topFromText="0" w:bottomFromText="0" w:vertAnchor="page" w:horzAnchor="margin" w:tblpX="-1521" w:tblpY="5235"/>
+            <w:tblW w:w="11670.0" w:type="dxa"/>
             <w:jc w:val="left"/>
             <w:tblBorders>
               <w:top w:color="bfbfbf" w:space="0" w:sz="4" w:val="single"/>
@@ -1116,31 +1370,31 @@
             <w:tblLook w:val="0400"/>
           </w:tblPr>
           <w:tblGrid>
-            <w:gridCol w:w="1328"/>
-            <w:gridCol w:w="1077"/>
-            <w:gridCol w:w="1276"/>
-            <w:gridCol w:w="1276"/>
-            <w:gridCol w:w="1275"/>
-            <w:gridCol w:w="1276"/>
-            <w:gridCol w:w="1418"/>
-            <w:gridCol w:w="850"/>
+            <w:gridCol w:w="1545"/>
+            <w:gridCol w:w="1500"/>
+            <w:gridCol w:w="1335"/>
+            <w:gridCol w:w="1095"/>
+            <w:gridCol w:w="1395"/>
+            <w:gridCol w:w="1785"/>
+            <w:gridCol w:w="1290"/>
+            <w:gridCol w:w="1725"/>
             <w:tblGridChange w:id="0">
               <w:tblGrid>
-                <w:gridCol w:w="1328"/>
-                <w:gridCol w:w="1077"/>
-                <w:gridCol w:w="1276"/>
-                <w:gridCol w:w="1276"/>
-                <w:gridCol w:w="1275"/>
-                <w:gridCol w:w="1276"/>
-                <w:gridCol w:w="1418"/>
-                <w:gridCol w:w="850"/>
+                <w:gridCol w:w="1545"/>
+                <w:gridCol w:w="1500"/>
+                <w:gridCol w:w="1335"/>
+                <w:gridCol w:w="1095"/>
+                <w:gridCol w:w="1395"/>
+                <w:gridCol w:w="1785"/>
+                <w:gridCol w:w="1290"/>
+                <w:gridCol w:w="1725"/>
               </w:tblGrid>
             </w:tblGridChange>
           </w:tblGrid>
           <w:tr>
             <w:trPr>
               <w:cantSplit w:val="0"/>
-              <w:trHeight w:val="415" w:hRule="atLeast"/>
+              <w:trHeight w:val="435" w:hRule="atLeast"/>
               <w:tblHeader w:val="0"/>
             </w:trPr>
             <w:tc>
@@ -1385,36 +1639,25 @@
           <w:tr>
             <w:trPr>
               <w:cantSplit w:val="0"/>
-              <w:trHeight w:val="2410" w:hRule="atLeast"/>
+              <w:trHeight w:val="1048.8736979166665" w:hRule="atLeast"/>
               <w:tblHeader w:val="0"/>
             </w:trPr>
             <w:tc>
               <w:tcPr/>
               <w:p>
                 <w:pPr>
-                  <w:jc w:val="both"/>
-                  <w:rPr>
-                    <w:b w:val="1"/>
-                    <w:bCs w:val="1"/>
-                    <w:sz w:val="18"/>
-                    <w:szCs w:val="18"/>
-                  </w:rPr>
-                </w:pPr>
-                <w:r>
-                  <w:rPr>
-                    <w:i w:val="1"/>
-                    <w:iCs w:val="1"/>
-                    <w:color w:val="548dd4"/>
-                    <w:sz w:val="18"/>
-                    <w:szCs w:val="18"/>
-                    <w:rtl w:val="0"/>
-                  </w:rPr>
-                  <w:t xml:space="preserve">Nombra las competencias o unidades de competencias que se relacionan con las diferentes actividades requeridas para el desarrollo del proyecto APT.</w:t>
-                </w:r>
-                <w:r>
-                  <w:rPr>
-                    <w:rtl w:val="0"/>
-                  </w:rPr>
+                  <w:rPr>
+                    <w:sz w:val="20"/>
+                    <w:szCs w:val="20"/>
+                  </w:rPr>
+                </w:pPr>
+                <w:r>
+                  <w:rPr>
+                    <w:sz w:val="20"/>
+                    <w:szCs w:val="20"/>
+                    <w:rtl w:val="0"/>
+                  </w:rPr>
+                  <w:t xml:space="preserve">Diseño de bases de datos </w:t>
                 </w:r>
               </w:p>
             </w:tc>
@@ -1422,25 +1665,18 @@
               <w:tcPr/>
               <w:p>
                 <w:pPr>
-                  <w:jc w:val="both"/>
-                  <w:rPr>
-                    <w:i w:val="1"/>
-                    <w:iCs w:val="1"/>
-                    <w:color w:val="548dd4"/>
-                    <w:sz w:val="18"/>
-                    <w:szCs w:val="18"/>
-                  </w:rPr>
-                </w:pPr>
-                <w:r>
-                  <w:rPr>
-                    <w:i w:val="1"/>
-                    <w:iCs w:val="1"/>
-                    <w:color w:val="548dd4"/>
-                    <w:sz w:val="18"/>
-                    <w:szCs w:val="18"/>
-                    <w:rtl w:val="0"/>
-                  </w:rPr>
-                  <w:t xml:space="preserve">Nombra las actividades que se necesitan para desarrollar el proyecto APT. </w:t>
+                  <w:rPr>
+                    <w:sz w:val="20"/>
+                    <w:szCs w:val="20"/>
+                  </w:rPr>
+                </w:pPr>
+                <w:r>
+                  <w:rPr>
+                    <w:sz w:val="20"/>
+                    <w:szCs w:val="20"/>
+                    <w:rtl w:val="0"/>
+                  </w:rPr>
+                  <w:t xml:space="preserve">Elaboración del modelo relacional </w:t>
                 </w:r>
               </w:p>
             </w:tc>
@@ -1448,29 +1684,62 @@
               <w:tcPr/>
               <w:p>
                 <w:pPr>
-                  <w:jc w:val="both"/>
-                  <w:rPr>
-                    <w:b w:val="1"/>
-                    <w:bCs w:val="1"/>
-                    <w:sz w:val="18"/>
-                    <w:szCs w:val="18"/>
-                  </w:rPr>
-                </w:pPr>
-                <w:r>
-                  <w:rPr>
-                    <w:i w:val="1"/>
-                    <w:iCs w:val="1"/>
-                    <w:color w:val="548dd4"/>
-                    <w:sz w:val="18"/>
-                    <w:szCs w:val="18"/>
-                    <w:rtl w:val="0"/>
-                  </w:rPr>
-                  <w:t xml:space="preserve">Nombra los recursos necesarios para llevar a cabo las actividades definidas.</w:t>
-                </w:r>
-                <w:r>
-                  <w:rPr>
-                    <w:rtl w:val="0"/>
-                  </w:rPr>
+                  <w:rPr>
+                    <w:sz w:val="20"/>
+                    <w:szCs w:val="20"/>
+                  </w:rPr>
+                </w:pPr>
+                <w:r>
+                  <w:rPr>
+                    <w:sz w:val="20"/>
+                    <w:szCs w:val="20"/>
+                    <w:rtl w:val="0"/>
+                  </w:rPr>
+                  <w:t xml:space="preserve">Oracle SQL Developer Data Modeler </w:t>
+                </w:r>
+              </w:p>
+            </w:tc>
+            <w:tc>
+              <w:tcPr>
+                <w:vAlign w:val="center"/>
+              </w:tcPr>
+              <w:p>
+                <w:pPr>
+                  <w:jc w:val="center"/>
+                  <w:rPr>
+                    <w:sz w:val="20"/>
+                    <w:szCs w:val="20"/>
+                  </w:rPr>
+                </w:pPr>
+                <w:r>
+                  <w:rPr>
+                    <w:sz w:val="20"/>
+                    <w:szCs w:val="20"/>
+                    <w:rtl w:val="0"/>
+                  </w:rPr>
+                  <w:t xml:space="preserve">1 semana </w:t>
+                </w:r>
+              </w:p>
+            </w:tc>
+            <w:tc>
+              <w:tcPr>
+                <w:vAlign w:val="center"/>
+              </w:tcPr>
+              <w:p>
+                <w:pPr>
+                  <w:jc w:val="center"/>
+                  <w:rPr>
+                    <w:sz w:val="20"/>
+                    <w:szCs w:val="20"/>
+                  </w:rPr>
+                </w:pPr>
+                <w:r>
+                  <w:rPr>
+                    <w:sz w:val="20"/>
+                    <w:szCs w:val="20"/>
+                    <w:rtl w:val="0"/>
+                  </w:rPr>
+                  <w:t xml:space="preserve">Leandro Cáceres </w:t>
                 </w:r>
               </w:p>
             </w:tc>
@@ -1478,29 +1747,40 @@
               <w:tcPr/>
               <w:p>
                 <w:pPr>
-                  <w:jc w:val="both"/>
-                  <w:rPr>
-                    <w:b w:val="1"/>
-                    <w:bCs w:val="1"/>
-                    <w:sz w:val="18"/>
-                    <w:szCs w:val="18"/>
-                  </w:rPr>
-                </w:pPr>
-                <w:r>
-                  <w:rPr>
-                    <w:i w:val="1"/>
-                    <w:iCs w:val="1"/>
-                    <w:color w:val="548dd4"/>
-                    <w:sz w:val="18"/>
-                    <w:szCs w:val="18"/>
-                    <w:rtl w:val="0"/>
-                  </w:rPr>
-                  <w:t xml:space="preserve">Señala la duración de cada actividad. </w:t>
-                </w:r>
-                <w:r>
-                  <w:rPr>
-                    <w:rtl w:val="0"/>
-                  </w:rPr>
+                  <w:rPr>
+                    <w:sz w:val="20"/>
+                    <w:szCs w:val="20"/>
+                  </w:rPr>
+                </w:pPr>
+                <w:r>
+                  <w:rPr>
+                    <w:sz w:val="20"/>
+                    <w:szCs w:val="20"/>
+                    <w:rtl w:val="0"/>
+                  </w:rPr>
+                  <w:t xml:space="preserve">Se realizaron correcciones en relaciones y estructura </w:t>
+                </w:r>
+              </w:p>
+            </w:tc>
+            <w:tc>
+              <w:tcPr>
+                <w:vAlign w:val="center"/>
+              </w:tcPr>
+              <w:p>
+                <w:pPr>
+                  <w:jc w:val="center"/>
+                  <w:rPr>
+                    <w:sz w:val="20"/>
+                    <w:szCs w:val="20"/>
+                  </w:rPr>
+                </w:pPr>
+                <w:r>
+                  <w:rPr>
+                    <w:sz w:val="20"/>
+                    <w:szCs w:val="20"/>
+                    <w:rtl w:val="0"/>
+                  </w:rPr>
+                  <w:t xml:space="preserve">Completado </w:t>
                 </w:r>
               </w:p>
             </w:tc>
@@ -1508,51 +1788,44 @@
               <w:tcPr/>
               <w:p>
                 <w:pPr>
-                  <w:jc w:val="both"/>
-                  <w:rPr>
-                    <w:i w:val="1"/>
-                    <w:iCs w:val="1"/>
-                    <w:color w:val="548dd4"/>
-                    <w:sz w:val="18"/>
-                    <w:szCs w:val="18"/>
-                  </w:rPr>
-                </w:pPr>
-                <w:r>
-                  <w:rPr>
-                    <w:i w:val="1"/>
-                    <w:iCs w:val="1"/>
-                    <w:color w:val="548dd4"/>
-                    <w:sz w:val="18"/>
-                    <w:szCs w:val="18"/>
-                    <w:rtl w:val="0"/>
-                  </w:rPr>
-                  <w:t xml:space="preserve">Escribe el nombre del integrante del equipo responsable de cada actividad.</w:t>
-                </w:r>
-              </w:p>
-            </w:tc>
+                  <w:rPr>
+                    <w:sz w:val="20"/>
+                    <w:szCs w:val="20"/>
+                  </w:rPr>
+                </w:pPr>
+                <w:r>
+                  <w:rPr>
+                    <w:sz w:val="20"/>
+                    <w:szCs w:val="20"/>
+                    <w:rtl w:val="0"/>
+                  </w:rPr>
+                  <w:t xml:space="preserve">Ajuste de relaciones entre entidades </w:t>
+                </w:r>
+              </w:p>
+            </w:tc>
+          </w:tr>
+          <w:tr>
+            <w:trPr>
+              <w:cantSplit w:val="0"/>
+              <w:trHeight w:val="1093.8736979166665" w:hRule="atLeast"/>
+              <w:tblHeader w:val="0"/>
+            </w:trPr>
             <w:tc>
               <w:tcPr/>
               <w:p>
                 <w:pPr>
-                  <w:jc w:val="both"/>
-                  <w:rPr>
-                    <w:i w:val="1"/>
-                    <w:iCs w:val="1"/>
-                    <w:color w:val="548dd4"/>
-                    <w:sz w:val="18"/>
-                    <w:szCs w:val="18"/>
-                  </w:rPr>
-                </w:pPr>
-                <w:r>
-                  <w:rPr>
-                    <w:i w:val="1"/>
-                    <w:iCs w:val="1"/>
-                    <w:color w:val="548dd4"/>
-                    <w:sz w:val="18"/>
-                    <w:szCs w:val="18"/>
-                    <w:rtl w:val="0"/>
-                  </w:rPr>
-                  <w:t xml:space="preserve">Señala las dificultades o facilitadores que se podrían presentar durante la ejecución de cada una de las actividades propuestas.</w:t>
+                  <w:rPr>
+                    <w:sz w:val="20"/>
+                    <w:szCs w:val="20"/>
+                  </w:rPr>
+                </w:pPr>
+                <w:r>
+                  <w:rPr>
+                    <w:sz w:val="20"/>
+                    <w:szCs w:val="20"/>
+                    <w:rtl w:val="0"/>
+                  </w:rPr>
+                  <w:t xml:space="preserve">Arquitectura de software </w:t>
                 </w:r>
               </w:p>
             </w:tc>
@@ -1560,99 +1833,18 @@
               <w:tcPr/>
               <w:p>
                 <w:pPr>
-                  <w:jc w:val="both"/>
-                  <w:rPr>
-                    <w:i w:val="1"/>
-                    <w:iCs w:val="1"/>
-                    <w:color w:val="548dd4"/>
-                    <w:sz w:val="18"/>
-                    <w:szCs w:val="18"/>
-                  </w:rPr>
-                </w:pPr>
-                <w:r>
-                  <w:rPr>
-                    <w:i w:val="1"/>
-                    <w:iCs w:val="1"/>
-                    <w:color w:val="548dd4"/>
-                    <w:sz w:val="18"/>
-                    <w:szCs w:val="18"/>
-                    <w:rtl w:val="0"/>
-                  </w:rPr>
-                  <w:t xml:space="preserve">Describe el estado de avance de cada actividad.</w:t>
-                </w:r>
-              </w:p>
-              <w:p>
-                <w:pPr>
-                  <w:jc w:val="both"/>
-                  <w:rPr>
-                    <w:i w:val="1"/>
-                    <w:iCs w:val="1"/>
-                    <w:color w:val="c00000"/>
-                    <w:sz w:val="16"/>
-                    <w:szCs w:val="16"/>
-                  </w:rPr>
-                </w:pPr>
-                <w:r>
-                  <w:rPr>
-                    <w:rtl w:val="0"/>
-                  </w:rPr>
-                </w:r>
-              </w:p>
-              <w:p>
-                <w:pPr>
-                  <w:jc w:val="both"/>
-                  <w:rPr>
-                    <w:i w:val="1"/>
-                    <w:iCs w:val="1"/>
-                    <w:color w:val="548dd4"/>
-                    <w:sz w:val="18"/>
-                    <w:szCs w:val="18"/>
-                  </w:rPr>
-                </w:pPr>
-                <w:r>
-                  <w:rPr>
-                    <w:i w:val="1"/>
-                    <w:iCs w:val="1"/>
-                    <w:color w:val="548dd4"/>
-                    <w:sz w:val="18"/>
-                    <w:szCs w:val="18"/>
-                    <w:rtl w:val="0"/>
-                  </w:rPr>
-                  <w:t xml:space="preserve">Tipos de estado: </w:t>
-                </w:r>
-              </w:p>
-              <w:p>
-                <w:pPr>
-                  <w:jc w:val="both"/>
-                  <w:rPr>
-                    <w:i w:val="1"/>
-                    <w:iCs w:val="1"/>
-                    <w:color w:val="c00000"/>
-                    <w:sz w:val="16"/>
-                    <w:szCs w:val="16"/>
-                  </w:rPr>
-                </w:pPr>
-                <w:r>
-                  <w:rPr>
-                    <w:i w:val="1"/>
-                    <w:iCs w:val="1"/>
-                    <w:color w:val="548dd4"/>
-                    <w:sz w:val="18"/>
-                    <w:szCs w:val="18"/>
-                    <w:rtl w:val="0"/>
-                  </w:rPr>
-                  <w:t xml:space="preserve">En curso/ Con retraso/ No iniciado/ Completado/ Ajustada</w:t>
-                </w:r>
-                <w:r>
-                  <w:rPr>
-                    <w:i w:val="1"/>
-                    <w:iCs w:val="1"/>
-                    <w:color w:val="c00000"/>
-                    <w:sz w:val="16"/>
-                    <w:szCs w:val="16"/>
-                    <w:rtl w:val="0"/>
-                  </w:rPr>
-                  <w:t xml:space="preserve"> </w:t>
+                  <w:rPr>
+                    <w:sz w:val="20"/>
+                    <w:szCs w:val="20"/>
+                  </w:rPr>
+                </w:pPr>
+                <w:r>
+                  <w:rPr>
+                    <w:sz w:val="20"/>
+                    <w:szCs w:val="20"/>
+                    <w:rtl w:val="0"/>
+                  </w:rPr>
+                  <w:t xml:space="preserve">Desarrollo de diagramas C4 </w:t>
                 </w:r>
               </w:p>
             </w:tc>
@@ -1660,25 +1852,954 @@
               <w:tcPr/>
               <w:p>
                 <w:pPr>
-                  <w:jc w:val="both"/>
-                  <w:rPr>
-                    <w:i w:val="1"/>
-                    <w:iCs w:val="1"/>
-                    <w:color w:val="548dd4"/>
-                    <w:sz w:val="18"/>
-                    <w:szCs w:val="18"/>
-                  </w:rPr>
-                </w:pPr>
-                <w:r>
-                  <w:rPr>
-                    <w:i w:val="1"/>
-                    <w:iCs w:val="1"/>
-                    <w:color w:val="548dd4"/>
-                    <w:sz w:val="18"/>
-                    <w:szCs w:val="18"/>
-                    <w:rtl w:val="0"/>
-                  </w:rPr>
-                  <w:t xml:space="preserve">Señala los ajustes o reformulaciones que has realizado. </w:t>
+                  <w:rPr>
+                    <w:sz w:val="20"/>
+                    <w:szCs w:val="20"/>
+                  </w:rPr>
+                </w:pPr>
+                <w:r>
+                  <w:rPr>
+                    <w:sz w:val="20"/>
+                    <w:szCs w:val="20"/>
+                    <w:rtl w:val="0"/>
+                  </w:rPr>
+                  <w:t xml:space="preserve">Draw.io </w:t>
+                </w:r>
+              </w:p>
+            </w:tc>
+            <w:tc>
+              <w:tcPr>
+                <w:vAlign w:val="center"/>
+              </w:tcPr>
+              <w:p>
+                <w:pPr>
+                  <w:jc w:val="center"/>
+                  <w:rPr>
+                    <w:sz w:val="20"/>
+                    <w:szCs w:val="20"/>
+                  </w:rPr>
+                </w:pPr>
+                <w:r>
+                  <w:rPr>
+                    <w:sz w:val="20"/>
+                    <w:szCs w:val="20"/>
+                    <w:rtl w:val="0"/>
+                  </w:rPr>
+                  <w:t xml:space="preserve">4 días </w:t>
+                </w:r>
+              </w:p>
+            </w:tc>
+            <w:tc>
+              <w:tcPr>
+                <w:vAlign w:val="center"/>
+              </w:tcPr>
+              <w:p>
+                <w:pPr>
+                  <w:jc w:val="center"/>
+                  <w:rPr>
+                    <w:sz w:val="20"/>
+                    <w:szCs w:val="20"/>
+                  </w:rPr>
+                </w:pPr>
+                <w:r>
+                  <w:rPr>
+                    <w:sz w:val="20"/>
+                    <w:szCs w:val="20"/>
+                    <w:rtl w:val="0"/>
+                  </w:rPr>
+                  <w:t xml:space="preserve">Edinson Delgado </w:t>
+                </w:r>
+              </w:p>
+            </w:tc>
+            <w:tc>
+              <w:tcPr/>
+              <w:p>
+                <w:pPr>
+                  <w:rPr>
+                    <w:sz w:val="20"/>
+                    <w:szCs w:val="20"/>
+                  </w:rPr>
+                </w:pPr>
+                <w:r>
+                  <w:rPr>
+                    <w:sz w:val="20"/>
+                    <w:szCs w:val="20"/>
+                    <w:rtl w:val="0"/>
+                  </w:rPr>
+                  <w:t xml:space="preserve">Se definieron contexto, contenedores y componentes </w:t>
+                </w:r>
+              </w:p>
+            </w:tc>
+            <w:tc>
+              <w:tcPr>
+                <w:vAlign w:val="center"/>
+              </w:tcPr>
+              <w:p>
+                <w:pPr>
+                  <w:jc w:val="center"/>
+                  <w:rPr>
+                    <w:sz w:val="20"/>
+                    <w:szCs w:val="20"/>
+                  </w:rPr>
+                </w:pPr>
+                <w:r>
+                  <w:rPr>
+                    <w:sz w:val="20"/>
+                    <w:szCs w:val="20"/>
+                    <w:rtl w:val="0"/>
+                  </w:rPr>
+                  <w:t xml:space="preserve">Completado </w:t>
+                </w:r>
+              </w:p>
+            </w:tc>
+            <w:tc>
+              <w:tcPr/>
+              <w:p>
+                <w:pPr>
+                  <w:rPr>
+                    <w:sz w:val="20"/>
+                    <w:szCs w:val="20"/>
+                  </w:rPr>
+                </w:pPr>
+                <w:r>
+                  <w:rPr>
+                    <w:sz w:val="20"/>
+                    <w:szCs w:val="20"/>
+                    <w:rtl w:val="0"/>
+                  </w:rPr>
+                  <w:t xml:space="preserve">Se simplificó la arquitectura </w:t>
+                </w:r>
+              </w:p>
+            </w:tc>
+          </w:tr>
+          <w:tr>
+            <w:trPr>
+              <w:cantSplit w:val="0"/>
+              <w:trHeight w:val="1003.4863281249999" w:hRule="atLeast"/>
+              <w:tblHeader w:val="0"/>
+            </w:trPr>
+            <w:tc>
+              <w:tcPr/>
+              <w:p>
+                <w:pPr>
+                  <w:rPr>
+                    <w:sz w:val="20"/>
+                    <w:szCs w:val="20"/>
+                  </w:rPr>
+                </w:pPr>
+                <w:r>
+                  <w:rPr>
+                    <w:sz w:val="20"/>
+                    <w:szCs w:val="20"/>
+                    <w:rtl w:val="0"/>
+                  </w:rPr>
+                  <w:t xml:space="preserve">Investigación tecnológica </w:t>
+                </w:r>
+              </w:p>
+            </w:tc>
+            <w:tc>
+              <w:tcPr/>
+              <w:p>
+                <w:pPr>
+                  <w:rPr>
+                    <w:sz w:val="20"/>
+                    <w:szCs w:val="20"/>
+                  </w:rPr>
+                </w:pPr>
+                <w:r>
+                  <w:rPr>
+                    <w:sz w:val="20"/>
+                    <w:szCs w:val="20"/>
+                    <w:rtl w:val="0"/>
+                  </w:rPr>
+                  <w:t xml:space="preserve">Evaluación de Supabase y PostgreSQL </w:t>
+                </w:r>
+              </w:p>
+            </w:tc>
+            <w:tc>
+              <w:tcPr/>
+              <w:p>
+                <w:pPr>
+                  <w:rPr>
+                    <w:sz w:val="20"/>
+                    <w:szCs w:val="20"/>
+                  </w:rPr>
+                </w:pPr>
+                <w:r>
+                  <w:rPr>
+                    <w:sz w:val="20"/>
+                    <w:szCs w:val="20"/>
+                    <w:rtl w:val="0"/>
+                  </w:rPr>
+                  <w:t xml:space="preserve">Internet y documentación oficial </w:t>
+                </w:r>
+              </w:p>
+            </w:tc>
+            <w:tc>
+              <w:tcPr>
+                <w:vAlign w:val="center"/>
+              </w:tcPr>
+              <w:p>
+                <w:pPr>
+                  <w:jc w:val="center"/>
+                  <w:rPr>
+                    <w:sz w:val="20"/>
+                    <w:szCs w:val="20"/>
+                  </w:rPr>
+                </w:pPr>
+                <w:r>
+                  <w:rPr>
+                    <w:sz w:val="20"/>
+                    <w:szCs w:val="20"/>
+                    <w:rtl w:val="0"/>
+                  </w:rPr>
+                  <w:t xml:space="preserve">2 días </w:t>
+                </w:r>
+              </w:p>
+            </w:tc>
+            <w:tc>
+              <w:tcPr>
+                <w:vAlign w:val="center"/>
+              </w:tcPr>
+              <w:p>
+                <w:pPr>
+                  <w:jc w:val="center"/>
+                  <w:rPr>
+                    <w:sz w:val="20"/>
+                    <w:szCs w:val="20"/>
+                  </w:rPr>
+                </w:pPr>
+                <w:r>
+                  <w:rPr>
+                    <w:sz w:val="20"/>
+                    <w:szCs w:val="20"/>
+                    <w:rtl w:val="0"/>
+                  </w:rPr>
+                  <w:t xml:space="preserve">Edinson Delgado </w:t>
+                </w:r>
+              </w:p>
+            </w:tc>
+            <w:tc>
+              <w:tcPr/>
+              <w:p>
+                <w:pPr>
+                  <w:rPr>
+                    <w:sz w:val="20"/>
+                    <w:szCs w:val="20"/>
+                  </w:rPr>
+                </w:pPr>
+                <w:r>
+                  <w:rPr>
+                    <w:sz w:val="20"/>
+                    <w:szCs w:val="20"/>
+                    <w:rtl w:val="0"/>
+                  </w:rPr>
+                  <w:t xml:space="preserve">Compatible con el desarrollo del sistema </w:t>
+                </w:r>
+              </w:p>
+            </w:tc>
+            <w:tc>
+              <w:tcPr>
+                <w:vAlign w:val="center"/>
+              </w:tcPr>
+              <w:p>
+                <w:pPr>
+                  <w:jc w:val="center"/>
+                  <w:rPr>
+                    <w:sz w:val="20"/>
+                    <w:szCs w:val="20"/>
+                  </w:rPr>
+                </w:pPr>
+                <w:r>
+                  <w:rPr>
+                    <w:sz w:val="20"/>
+                    <w:szCs w:val="20"/>
+                    <w:rtl w:val="0"/>
+                  </w:rPr>
+                  <w:t xml:space="preserve">Completado </w:t>
+                </w:r>
+              </w:p>
+            </w:tc>
+            <w:tc>
+              <w:tcPr/>
+              <w:p>
+                <w:pPr>
+                  <w:rPr>
+                    <w:sz w:val="20"/>
+                    <w:szCs w:val="20"/>
+                  </w:rPr>
+                </w:pPr>
+                <w:r>
+                  <w:rPr>
+                    <w:sz w:val="20"/>
+                    <w:szCs w:val="20"/>
+                    <w:rtl w:val="0"/>
+                  </w:rPr>
+                  <w:t xml:space="preserve">Ninguno </w:t>
+                </w:r>
+              </w:p>
+            </w:tc>
+          </w:tr>
+          <w:tr>
+            <w:trPr>
+              <w:cantSplit w:val="0"/>
+              <w:trHeight w:val="1275" w:hRule="atLeast"/>
+              <w:tblHeader w:val="0"/>
+            </w:trPr>
+            <w:tc>
+              <w:tcPr/>
+              <w:p>
+                <w:pPr>
+                  <w:rPr>
+                    <w:sz w:val="20"/>
+                    <w:szCs w:val="20"/>
+                  </w:rPr>
+                </w:pPr>
+                <w:r>
+                  <w:rPr>
+                    <w:sz w:val="20"/>
+                    <w:szCs w:val="20"/>
+                    <w:rtl w:val="0"/>
+                  </w:rPr>
+                  <w:t xml:space="preserve">Análisis del sistema </w:t>
+                </w:r>
+              </w:p>
+            </w:tc>
+            <w:tc>
+              <w:tcPr/>
+              <w:p>
+                <w:pPr>
+                  <w:rPr>
+                    <w:sz w:val="20"/>
+                    <w:szCs w:val="20"/>
+                  </w:rPr>
+                </w:pPr>
+                <w:r>
+                  <w:rPr>
+                    <w:sz w:val="20"/>
+                    <w:szCs w:val="20"/>
+                    <w:rtl w:val="0"/>
+                  </w:rPr>
+                  <w:t xml:space="preserve">Definición de roles y cargos </w:t>
+                </w:r>
+              </w:p>
+            </w:tc>
+            <w:tc>
+              <w:tcPr/>
+              <w:p>
+                <w:pPr>
+                  <w:rPr>
+                    <w:sz w:val="20"/>
+                    <w:szCs w:val="20"/>
+                  </w:rPr>
+                </w:pPr>
+                <w:r>
+                  <w:rPr>
+                    <w:sz w:val="20"/>
+                    <w:szCs w:val="20"/>
+                    <w:rtl w:val="0"/>
+                  </w:rPr>
+                  <w:t xml:space="preserve">Documentación del proyecto </w:t>
+                </w:r>
+              </w:p>
+            </w:tc>
+            <w:tc>
+              <w:tcPr>
+                <w:vAlign w:val="center"/>
+              </w:tcPr>
+              <w:p>
+                <w:pPr>
+                  <w:jc w:val="center"/>
+                  <w:rPr>
+                    <w:sz w:val="20"/>
+                    <w:szCs w:val="20"/>
+                  </w:rPr>
+                </w:pPr>
+                <w:r>
+                  <w:rPr>
+                    <w:sz w:val="20"/>
+                    <w:szCs w:val="20"/>
+                    <w:rtl w:val="0"/>
+                  </w:rPr>
+                  <w:t xml:space="preserve">3 días </w:t>
+                </w:r>
+              </w:p>
+            </w:tc>
+            <w:tc>
+              <w:tcPr>
+                <w:vAlign w:val="center"/>
+              </w:tcPr>
+              <w:p>
+                <w:pPr>
+                  <w:jc w:val="center"/>
+                  <w:rPr>
+                    <w:sz w:val="20"/>
+                    <w:szCs w:val="20"/>
+                  </w:rPr>
+                </w:pPr>
+                <w:r>
+                  <w:rPr>
+                    <w:sz w:val="20"/>
+                    <w:szCs w:val="20"/>
+                    <w:rtl w:val="0"/>
+                  </w:rPr>
+                  <w:t xml:space="preserve">Edinson Delgado, Leandro Cáceres </w:t>
+                </w:r>
+              </w:p>
+            </w:tc>
+            <w:tc>
+              <w:tcPr/>
+              <w:p>
+                <w:pPr>
+                  <w:rPr>
+                    <w:sz w:val="20"/>
+                    <w:szCs w:val="20"/>
+                  </w:rPr>
+                </w:pPr>
+                <w:r>
+                  <w:rPr>
+                    <w:sz w:val="20"/>
+                    <w:szCs w:val="20"/>
+                    <w:rtl w:val="0"/>
+                  </w:rPr>
+                  <w:t xml:space="preserve">Se diferenciaron roles y cargos dentro del sistema </w:t>
+                </w:r>
+              </w:p>
+            </w:tc>
+            <w:tc>
+              <w:tcPr>
+                <w:vAlign w:val="center"/>
+              </w:tcPr>
+              <w:p>
+                <w:pPr>
+                  <w:jc w:val="center"/>
+                  <w:rPr>
+                    <w:sz w:val="20"/>
+                    <w:szCs w:val="20"/>
+                  </w:rPr>
+                </w:pPr>
+                <w:r>
+                  <w:rPr>
+                    <w:sz w:val="20"/>
+                    <w:szCs w:val="20"/>
+                    <w:rtl w:val="0"/>
+                  </w:rPr>
+                  <w:t xml:space="preserve">Completado </w:t>
+                </w:r>
+              </w:p>
+            </w:tc>
+            <w:tc>
+              <w:tcPr/>
+              <w:p>
+                <w:pPr>
+                  <w:rPr>
+                    <w:sz w:val="20"/>
+                    <w:szCs w:val="20"/>
+                  </w:rPr>
+                </w:pPr>
+                <w:r>
+                  <w:rPr>
+                    <w:sz w:val="20"/>
+                    <w:szCs w:val="20"/>
+                    <w:rtl w:val="0"/>
+                  </w:rPr>
+                  <w:t xml:space="preserve">Ajuste de estructura organizacional </w:t>
+                </w:r>
+              </w:p>
+            </w:tc>
+          </w:tr>
+          <w:tr>
+            <w:trPr>
+              <w:cantSplit w:val="0"/>
+              <w:trHeight w:val="795" w:hRule="atLeast"/>
+              <w:tblHeader w:val="0"/>
+            </w:trPr>
+            <w:tc>
+              <w:tcPr/>
+              <w:p>
+                <w:pPr>
+                  <w:rPr>
+                    <w:sz w:val="20"/>
+                    <w:szCs w:val="20"/>
+                  </w:rPr>
+                </w:pPr>
+                <w:r>
+                  <w:rPr>
+                    <w:sz w:val="20"/>
+                    <w:szCs w:val="20"/>
+                    <w:rtl w:val="0"/>
+                  </w:rPr>
+                  <w:t xml:space="preserve">Diseño funcional </w:t>
+                </w:r>
+              </w:p>
+            </w:tc>
+            <w:tc>
+              <w:tcPr/>
+              <w:p>
+                <w:pPr>
+                  <w:rPr>
+                    <w:sz w:val="20"/>
+                    <w:szCs w:val="20"/>
+                  </w:rPr>
+                </w:pPr>
+                <w:r>
+                  <w:rPr>
+                    <w:sz w:val="20"/>
+                    <w:szCs w:val="20"/>
+                    <w:rtl w:val="0"/>
+                  </w:rPr>
+                  <w:t xml:space="preserve">Definición de funcionalidades principales </w:t>
+                </w:r>
+              </w:p>
+            </w:tc>
+            <w:tc>
+              <w:tcPr/>
+              <w:p>
+                <w:pPr>
+                  <w:rPr>
+                    <w:sz w:val="20"/>
+                    <w:szCs w:val="20"/>
+                  </w:rPr>
+                </w:pPr>
+                <w:r>
+                  <w:rPr>
+                    <w:sz w:val="20"/>
+                    <w:szCs w:val="20"/>
+                    <w:rtl w:val="0"/>
+                  </w:rPr>
+                  <w:t xml:space="preserve">Reuniones y planificación </w:t>
+                </w:r>
+              </w:p>
+            </w:tc>
+            <w:tc>
+              <w:tcPr>
+                <w:vAlign w:val="center"/>
+              </w:tcPr>
+              <w:p>
+                <w:pPr>
+                  <w:jc w:val="center"/>
+                  <w:rPr>
+                    <w:sz w:val="20"/>
+                    <w:szCs w:val="20"/>
+                  </w:rPr>
+                </w:pPr>
+                <w:r>
+                  <w:rPr>
+                    <w:sz w:val="20"/>
+                    <w:szCs w:val="20"/>
+                    <w:rtl w:val="0"/>
+                  </w:rPr>
+                  <w:t xml:space="preserve">3 días </w:t>
+                </w:r>
+              </w:p>
+            </w:tc>
+            <w:tc>
+              <w:tcPr>
+                <w:vAlign w:val="center"/>
+              </w:tcPr>
+              <w:p>
+                <w:pPr>
+                  <w:jc w:val="center"/>
+                  <w:rPr>
+                    <w:sz w:val="20"/>
+                    <w:szCs w:val="20"/>
+                  </w:rPr>
+                </w:pPr>
+                <w:r>
+                  <w:rPr>
+                    <w:sz w:val="20"/>
+                    <w:szCs w:val="20"/>
+                    <w:rtl w:val="0"/>
+                  </w:rPr>
+                  <w:t xml:space="preserve">Edinson Delgado, Leandro Cáceres </w:t>
+                </w:r>
+              </w:p>
+            </w:tc>
+            <w:tc>
+              <w:tcPr/>
+              <w:p>
+                <w:pPr>
+                  <w:rPr>
+                    <w:sz w:val="20"/>
+                    <w:szCs w:val="20"/>
+                  </w:rPr>
+                </w:pPr>
+                <w:r>
+                  <w:rPr>
+                    <w:sz w:val="20"/>
+                    <w:szCs w:val="20"/>
+                    <w:rtl w:val="0"/>
+                  </w:rPr>
+                  <w:t xml:space="preserve">Se definieron solicitudes y certificados </w:t>
+                </w:r>
+              </w:p>
+            </w:tc>
+            <w:tc>
+              <w:tcPr>
+                <w:vAlign w:val="center"/>
+              </w:tcPr>
+              <w:p>
+                <w:pPr>
+                  <w:jc w:val="center"/>
+                  <w:rPr>
+                    <w:sz w:val="20"/>
+                    <w:szCs w:val="20"/>
+                  </w:rPr>
+                </w:pPr>
+                <w:r>
+                  <w:rPr>
+                    <w:sz w:val="20"/>
+                    <w:szCs w:val="20"/>
+                    <w:rtl w:val="0"/>
+                  </w:rPr>
+                  <w:t xml:space="preserve">En curso </w:t>
+                </w:r>
+              </w:p>
+            </w:tc>
+            <w:tc>
+              <w:tcPr/>
+              <w:p>
+                <w:pPr>
+                  <w:rPr>
+                    <w:sz w:val="20"/>
+                    <w:szCs w:val="20"/>
+                  </w:rPr>
+                </w:pPr>
+                <w:r>
+                  <w:rPr>
+                    <w:sz w:val="20"/>
+                    <w:szCs w:val="20"/>
+                    <w:rtl w:val="0"/>
+                  </w:rPr>
+                  <w:t xml:space="preserve">Ajustes menores </w:t>
+                </w:r>
+              </w:p>
+            </w:tc>
+          </w:tr>
+          <w:tr>
+            <w:trPr>
+              <w:cantSplit w:val="0"/>
+              <w:trHeight w:val="780" w:hRule="atLeast"/>
+              <w:tblHeader w:val="0"/>
+            </w:trPr>
+            <w:tc>
+              <w:tcPr/>
+              <w:p>
+                <w:pPr>
+                  <w:rPr>
+                    <w:sz w:val="20"/>
+                    <w:szCs w:val="20"/>
+                  </w:rPr>
+                </w:pPr>
+                <w:r>
+                  <w:rPr>
+                    <w:sz w:val="20"/>
+                    <w:szCs w:val="20"/>
+                    <w:rtl w:val="0"/>
+                  </w:rPr>
+                  <w:t xml:space="preserve">Desarrollo frontend </w:t>
+                </w:r>
+              </w:p>
+            </w:tc>
+            <w:tc>
+              <w:tcPr/>
+              <w:p>
+                <w:pPr>
+                  <w:rPr>
+                    <w:sz w:val="20"/>
+                    <w:szCs w:val="20"/>
+                  </w:rPr>
+                </w:pPr>
+                <w:r>
+                  <w:rPr>
+                    <w:sz w:val="20"/>
+                    <w:szCs w:val="20"/>
+                    <w:rtl w:val="0"/>
+                  </w:rPr>
+                  <w:t xml:space="preserve">Diseño inicial de interfaz </w:t>
+                </w:r>
+              </w:p>
+            </w:tc>
+            <w:tc>
+              <w:tcPr/>
+              <w:p>
+                <w:pPr>
+                  <w:rPr>
+                    <w:sz w:val="20"/>
+                    <w:szCs w:val="20"/>
+                  </w:rPr>
+                </w:pPr>
+                <w:r>
+                  <w:rPr>
+                    <w:sz w:val="20"/>
+                    <w:szCs w:val="20"/>
+                    <w:rtl w:val="0"/>
+                  </w:rPr>
+                  <w:t xml:space="preserve">React y Figma </w:t>
+                </w:r>
+              </w:p>
+            </w:tc>
+            <w:tc>
+              <w:tcPr/>
+              <w:p>
+                <w:pPr>
+                  <w:jc w:val="center"/>
+                  <w:rPr>
+                    <w:sz w:val="20"/>
+                    <w:szCs w:val="20"/>
+                  </w:rPr>
+                </w:pPr>
+                <w:r>
+                  <w:rPr>
+                    <w:sz w:val="20"/>
+                    <w:szCs w:val="20"/>
+                    <w:rtl w:val="0"/>
+                  </w:rPr>
+                  <w:t xml:space="preserve">1 semana </w:t>
+                </w:r>
+              </w:p>
+            </w:tc>
+            <w:tc>
+              <w:tcPr/>
+              <w:p>
+                <w:pPr>
+                  <w:jc w:val="center"/>
+                  <w:rPr>
+                    <w:sz w:val="20"/>
+                    <w:szCs w:val="20"/>
+                  </w:rPr>
+                </w:pPr>
+                <w:r>
+                  <w:rPr>
+                    <w:sz w:val="20"/>
+                    <w:szCs w:val="20"/>
+                    <w:rtl w:val="0"/>
+                  </w:rPr>
+                  <w:t xml:space="preserve">Edinson Delgado </w:t>
+                </w:r>
+              </w:p>
+            </w:tc>
+            <w:tc>
+              <w:tcPr/>
+              <w:p>
+                <w:pPr>
+                  <w:rPr>
+                    <w:sz w:val="20"/>
+                    <w:szCs w:val="20"/>
+                  </w:rPr>
+                </w:pPr>
+                <w:r>
+                  <w:rPr>
+                    <w:sz w:val="20"/>
+                    <w:szCs w:val="20"/>
+                    <w:rtl w:val="0"/>
+                  </w:rPr>
+                  <w:t xml:space="preserve">Actividad aún no iniciada </w:t>
+                </w:r>
+              </w:p>
+            </w:tc>
+            <w:tc>
+              <w:tcPr>
+                <w:vAlign w:val="center"/>
+              </w:tcPr>
+              <w:p>
+                <w:pPr>
+                  <w:jc w:val="center"/>
+                  <w:rPr>
+                    <w:sz w:val="20"/>
+                    <w:szCs w:val="20"/>
+                  </w:rPr>
+                </w:pPr>
+                <w:r>
+                  <w:rPr>
+                    <w:sz w:val="20"/>
+                    <w:szCs w:val="20"/>
+                    <w:rtl w:val="0"/>
+                  </w:rPr>
+                  <w:t xml:space="preserve">No iniciado </w:t>
+                </w:r>
+              </w:p>
+            </w:tc>
+            <w:tc>
+              <w:tcPr/>
+              <w:p>
+                <w:pPr>
+                  <w:rPr>
+                    <w:sz w:val="20"/>
+                    <w:szCs w:val="20"/>
+                  </w:rPr>
+                </w:pPr>
+                <w:r>
+                  <w:rPr>
+                    <w:sz w:val="20"/>
+                    <w:szCs w:val="20"/>
+                    <w:rtl w:val="0"/>
+                  </w:rPr>
+                  <w:t xml:space="preserve">Inicio en siguiente fase </w:t>
+                </w:r>
+              </w:p>
+            </w:tc>
+          </w:tr>
+          <w:tr>
+            <w:trPr>
+              <w:cantSplit w:val="0"/>
+              <w:trHeight w:val="646.36474609375" w:hRule="atLeast"/>
+              <w:tblHeader w:val="0"/>
+            </w:trPr>
+            <w:tc>
+              <w:tcPr/>
+              <w:p>
+                <w:pPr>
+                  <w:rPr>
+                    <w:sz w:val="20"/>
+                    <w:szCs w:val="20"/>
+                  </w:rPr>
+                </w:pPr>
+                <w:r>
+                  <w:rPr>
+                    <w:sz w:val="20"/>
+                    <w:szCs w:val="20"/>
+                    <w:rtl w:val="0"/>
+                  </w:rPr>
+                  <w:t xml:space="preserve">Desarrollo backend </w:t>
+                </w:r>
+              </w:p>
+            </w:tc>
+            <w:tc>
+              <w:tcPr/>
+              <w:p>
+                <w:pPr>
+                  <w:rPr>
+                    <w:sz w:val="20"/>
+                    <w:szCs w:val="20"/>
+                  </w:rPr>
+                </w:pPr>
+                <w:r>
+                  <w:rPr>
+                    <w:sz w:val="20"/>
+                    <w:szCs w:val="20"/>
+                    <w:rtl w:val="0"/>
+                  </w:rPr>
+                  <w:t xml:space="preserve">Configuración inicial de Supabase </w:t>
+                </w:r>
+              </w:p>
+            </w:tc>
+            <w:tc>
+              <w:tcPr/>
+              <w:p>
+                <w:pPr>
+                  <w:rPr>
+                    <w:sz w:val="20"/>
+                    <w:szCs w:val="20"/>
+                  </w:rPr>
+                </w:pPr>
+                <w:r>
+                  <w:rPr>
+                    <w:sz w:val="20"/>
+                    <w:szCs w:val="20"/>
+                    <w:rtl w:val="0"/>
+                  </w:rPr>
+                  <w:t xml:space="preserve">Supabase </w:t>
+                </w:r>
+              </w:p>
+            </w:tc>
+            <w:tc>
+              <w:tcPr/>
+              <w:p>
+                <w:pPr>
+                  <w:jc w:val="center"/>
+                  <w:rPr>
+                    <w:sz w:val="20"/>
+                    <w:szCs w:val="20"/>
+                  </w:rPr>
+                </w:pPr>
+                <w:r>
+                  <w:rPr>
+                    <w:sz w:val="20"/>
+                    <w:szCs w:val="20"/>
+                    <w:rtl w:val="0"/>
+                  </w:rPr>
+                  <w:t xml:space="preserve">1 semana </w:t>
+                </w:r>
+              </w:p>
+            </w:tc>
+            <w:tc>
+              <w:tcPr/>
+              <w:p>
+                <w:pPr>
+                  <w:jc w:val="center"/>
+                  <w:rPr>
+                    <w:sz w:val="20"/>
+                    <w:szCs w:val="20"/>
+                  </w:rPr>
+                </w:pPr>
+                <w:r>
+                  <w:rPr>
+                    <w:sz w:val="20"/>
+                    <w:szCs w:val="20"/>
+                    <w:rtl w:val="0"/>
+                  </w:rPr>
+                  <w:t xml:space="preserve">Leandro Cáceres </w:t>
+                </w:r>
+              </w:p>
+            </w:tc>
+            <w:tc>
+              <w:tcPr/>
+              <w:p>
+                <w:pPr>
+                  <w:rPr>
+                    <w:sz w:val="20"/>
+                    <w:szCs w:val="20"/>
+                  </w:rPr>
+                </w:pPr>
+                <w:r>
+                  <w:rPr>
+                    <w:sz w:val="20"/>
+                    <w:szCs w:val="20"/>
+                    <w:rtl w:val="0"/>
+                  </w:rPr>
+                  <w:t xml:space="preserve">Pendiente de implementación </w:t>
+                </w:r>
+              </w:p>
+            </w:tc>
+            <w:tc>
+              <w:tcPr>
+                <w:vAlign w:val="center"/>
+              </w:tcPr>
+              <w:p>
+                <w:pPr>
+                  <w:jc w:val="center"/>
+                  <w:rPr>
+                    <w:sz w:val="20"/>
+                    <w:szCs w:val="20"/>
+                  </w:rPr>
+                </w:pPr>
+                <w:r>
+                  <w:rPr>
+                    <w:sz w:val="20"/>
+                    <w:szCs w:val="20"/>
+                    <w:rtl w:val="0"/>
+                  </w:rPr>
+                  <w:t xml:space="preserve">No iniciado </w:t>
+                </w:r>
+              </w:p>
+            </w:tc>
+            <w:tc>
+              <w:tcPr/>
+              <w:p>
+                <w:pPr>
+                  <w:rPr>
+                    <w:sz w:val="20"/>
+                    <w:szCs w:val="20"/>
+                  </w:rPr>
+                </w:pPr>
+                <w:r>
+                  <w:rPr>
+                    <w:sz w:val="20"/>
+                    <w:szCs w:val="20"/>
+                    <w:rtl w:val="0"/>
+                  </w:rPr>
+                  <w:t xml:space="preserve">Se realizará posteriormente </w:t>
                 </w:r>
               </w:p>
             </w:tc>
@@ -1694,51 +2815,6 @@
           <w:szCs w:val="24"/>
         </w:rPr>
       </w:pPr>
-      <w:r>
-        <w:rPr>
-          <w:rtl w:val="0"/>
-        </w:rPr>
-      </w:r>
-    </w:p>
-    <w:p>
-      <w:pPr>
-        <w:rPr>
-          <w:color w:val="595959"/>
-          <w:sz w:val="24"/>
-          <w:szCs w:val="24"/>
-        </w:rPr>
-      </w:pPr>
-      <w:r>
-        <w:rPr>
-          <w:rtl w:val="0"/>
-        </w:rPr>
-      </w:r>
-    </w:p>
-    <w:p>
-      <w:pPr>
-        <w:rPr>
-          <w:color w:val="595959"/>
-          <w:sz w:val="24"/>
-          <w:szCs w:val="24"/>
-        </w:rPr>
-      </w:pPr>
-      <w:r>
-        <w:rPr>
-          <w:rtl w:val="0"/>
-        </w:rPr>
-      </w:r>
-    </w:p>
-    <w:p>
-      <w:pPr>
-        <w:rPr>
-          <w:color w:val="595959"/>
-          <w:sz w:val="24"/>
-          <w:szCs w:val="24"/>
-        </w:rPr>
-      </w:pPr>
-      <w:r>
-        <w:br w:type="page"/>
-      </w:r>
       <w:r>
         <w:rPr>
           <w:rtl w:val="0"/>
@@ -1883,7 +2959,33 @@
                 <w:vertAlign w:val="baseline"/>
                 <w:rtl w:val="0"/>
               </w:rPr>
-              <w:t xml:space="preserve">Profundiza en las observaciones de tu plan de trabajo. Analiza las actividades planificadas y señala qué aspectos facilitaron u obstaculizaron la ejecución del plan. Plantea cómo abordaste y/o abordarás los obstáculos. Por último, señala los ajustes que realizaste al plan de trabajo a partir de este análisis.</w:t>
+              <w:t xml:space="preserve">Profundiza en las observaciones de tu plan de trabajo. Analiza las actividades planificadas y señala qué aspectos facilitaron u obstaculizaron la ejecución del plan. Plantea cómo abordaste y/o </w:t>
+            </w:r>
+            <w:r>
+              <w:rPr>
+                <w:color w:val="1f3864"/>
+                <w:rtl w:val="0"/>
+              </w:rPr>
+              <w:t xml:space="preserve">abordar</w:t>
+            </w:r>
+            <w:r>
+              <w:rPr>
+                <w:rFonts w:ascii="Calibri" w:cs="Calibri" w:eastAsia="Calibri" w:hAnsi="Calibri"/>
+                <w:b w:val="0"/>
+                <w:bCs w:val="0"/>
+                <w:i w:val="0"/>
+                <w:iCs w:val="0"/>
+                <w:smallCaps w:val="0"/>
+                <w:strike w:val="0"/>
+                <w:color w:val="1f3864"/>
+                <w:sz w:val="22"/>
+                <w:szCs w:val="22"/>
+                <w:u w:val="none"/>
+                <w:shd w:fill="auto" w:val="clear"/>
+                <w:vertAlign w:val="baseline"/>
+                <w:rtl w:val="0"/>
+              </w:rPr>
+              <w:t xml:space="preserve"> los obstáculos. Por último, señala los ajustes que realizaste al plan de trabajo a partir de este análisis.</w:t>
             </w:r>
           </w:p>
         </w:tc>
@@ -1942,9 +3044,7 @@
             <w:pPr>
               <w:jc w:val="both"/>
               <w:rPr>
-                <w:rFonts w:ascii="Calibri" w:cs="Calibri" w:eastAsia="Calibri" w:hAnsi="Calibri"/>
-                <w:i w:val="1"/>
-                <w:iCs w:val="1"/>
+                <w:rFonts w:ascii="Arial" w:cs="Arial" w:eastAsia="Arial" w:hAnsi="Arial"/>
                 <w:color w:val="548dd4"/>
                 <w:sz w:val="20"/>
                 <w:szCs w:val="20"/>
@@ -1952,7 +3052,7 @@
             </w:pPr>
             <w:r>
               <w:rPr>
-                <w:rFonts w:ascii="Calibri" w:cs="Calibri" w:eastAsia="Calibri" w:hAnsi="Calibri"/>
+                <w:rFonts w:ascii="Arial" w:cs="Arial" w:eastAsia="Arial" w:hAnsi="Arial"/>
                 <w:color w:val="1f3864"/>
                 <w:rtl w:val="0"/>
               </w:rPr>
@@ -1960,7 +3060,7 @@
             </w:r>
             <w:r>
               <w:rPr>
-                <w:rFonts w:ascii="Calibri" w:cs="Calibri" w:eastAsia="Calibri" w:hAnsi="Calibri"/>
+                <w:rFonts w:ascii="Arial" w:cs="Arial" w:eastAsia="Arial" w:hAnsi="Arial"/>
                 <w:color w:val="548dd4"/>
                 <w:sz w:val="20"/>
                 <w:szCs w:val="20"/>
@@ -1970,106 +3070,43 @@
             </w:r>
             <w:r>
               <w:rPr>
-                <w:rFonts w:ascii="Calibri" w:cs="Calibri" w:eastAsia="Calibri" w:hAnsi="Calibri"/>
-                <w:i w:val="1"/>
-                <w:iCs w:val="1"/>
-                <w:color w:val="548dd4"/>
-                <w:sz w:val="20"/>
-                <w:szCs w:val="20"/>
-                <w:rtl w:val="0"/>
-              </w:rPr>
-              <w:t xml:space="preserve">Describe los factores que han facilitado y/o dificultado el desarrollo de tu Proyecto APT hasta ahora. En el caso de las dificultades debes describir qué acciones tomaste y/o tomarás para solucionarlas. </w:t>
-            </w:r>
-            <w:r>
-              <w:rPr>
-                <w:rFonts w:ascii="Calibri" w:cs="Calibri" w:eastAsia="Calibri" w:hAnsi="Calibri"/>
-                <w:b w:val="1"/>
-                <w:bCs w:val="1"/>
-                <w:color w:val="1f3864"/>
-                <w:rtl w:val="0"/>
-              </w:rPr>
-              <w:t xml:space="preserve"> </w:t>
-            </w:r>
-            <w:r>
-              <w:rPr>
                 <w:rtl w:val="0"/>
               </w:rPr>
             </w:r>
           </w:p>
           <w:p>
             <w:pPr>
-              <w:rPr>
-                <w:rFonts w:ascii="Calibri" w:cs="Calibri" w:eastAsia="Calibri" w:hAnsi="Calibri"/>
-                <w:color w:val="1f3864"/>
+              <w:spacing w:after="240" w:before="240" w:lineRule="auto"/>
+              <w:rPr>
+                <w:rFonts w:ascii="Arial" w:cs="Arial" w:eastAsia="Arial" w:hAnsi="Arial"/>
               </w:rPr>
             </w:pPr>
             <w:r>
               <w:rPr>
-                <w:rtl w:val="0"/>
-              </w:rPr>
+                <w:rFonts w:ascii="Arial" w:cs="Arial" w:eastAsia="Arial" w:hAnsi="Arial"/>
+                <w:rtl w:val="0"/>
+              </w:rPr>
+              <w:t xml:space="preserve">El desarrollo del proyecto se vio facilitado por el uso de herramientas como Supabase, Draw.io y Oracle SQL Developer Data Modeler, además de la metodología Kanban para organizar las tareas.</w:t>
             </w:r>
           </w:p>
           <w:p>
             <w:pPr>
-              <w:rPr>
-                <w:rFonts w:ascii="Calibri" w:cs="Calibri" w:eastAsia="Calibri" w:hAnsi="Calibri"/>
-                <w:color w:val="1f3864"/>
-              </w:rPr>
-            </w:pPr>
-            <w:r>
-              <w:rPr>
-                <w:rtl w:val="0"/>
-              </w:rPr>
-            </w:r>
-          </w:p>
-          <w:p>
-            <w:pPr>
-              <w:jc w:val="both"/>
-              <w:rPr>
-                <w:rFonts w:ascii="Calibri" w:cs="Calibri" w:eastAsia="Calibri" w:hAnsi="Calibri"/>
+              <w:spacing w:after="240" w:before="240" w:lineRule="auto"/>
+              <w:rPr>
+                <w:rFonts w:ascii="Arial" w:cs="Arial" w:eastAsia="Arial" w:hAnsi="Arial"/>
                 <w:i w:val="1"/>
                 <w:iCs w:val="1"/>
-                <w:color w:val="548dd4"/>
                 <w:sz w:val="20"/>
                 <w:szCs w:val="20"/>
               </w:rPr>
             </w:pPr>
             <w:r>
               <w:rPr>
-                <w:rtl w:val="0"/>
-              </w:rPr>
-            </w:r>
-          </w:p>
-          <w:p>
-            <w:pPr>
-              <w:jc w:val="both"/>
-              <w:rPr>
-                <w:rFonts w:ascii="Calibri" w:cs="Calibri" w:eastAsia="Calibri" w:hAnsi="Calibri"/>
-                <w:i w:val="1"/>
-                <w:iCs w:val="1"/>
-                <w:color w:val="548dd4"/>
-                <w:sz w:val="20"/>
-                <w:szCs w:val="20"/>
-              </w:rPr>
-            </w:pPr>
-            <w:r>
-              <w:rPr>
-                <w:rtl w:val="0"/>
-              </w:rPr>
-            </w:r>
-          </w:p>
-          <w:p>
-            <w:pPr>
-              <w:jc w:val="both"/>
-              <w:rPr>
-                <w:rFonts w:ascii="Calibri" w:cs="Calibri" w:eastAsia="Calibri" w:hAnsi="Calibri"/>
-                <w:i w:val="1"/>
-                <w:iCs w:val="1"/>
-                <w:color w:val="548dd4"/>
-                <w:sz w:val="20"/>
-                <w:szCs w:val="20"/>
-              </w:rPr>
-            </w:pPr>
+                <w:rFonts w:ascii="Arial" w:cs="Arial" w:eastAsia="Arial" w:hAnsi="Arial"/>
+                <w:rtl w:val="0"/>
+              </w:rPr>
+              <w:t xml:space="preserve">Sin embargo, surgieron dificultades relacionadas con la organización del modelo relacional y definición de roles y cargos del sistema. Estas dificultades fueron solucionadas mediante correcciones y retroalimentación docente.</w:t>
+            </w:r>
             <w:r>
               <w:rPr>
                 <w:rtl w:val="0"/>
@@ -2082,6 +3119,7 @@
     <w:p>
       <w:pPr>
         <w:rPr>
+          <w:rFonts w:ascii="Arial" w:cs="Arial" w:eastAsia="Arial" w:hAnsi="Arial"/>
           <w:color w:val="595959"/>
           <w:sz w:val="24"/>
           <w:szCs w:val="24"/>
@@ -2132,17 +3170,13 @@
             <w:pPr>
               <w:jc w:val="both"/>
               <w:rPr>
-                <w:rFonts w:ascii="Calibri" w:cs="Calibri" w:eastAsia="Calibri" w:hAnsi="Calibri"/>
-                <w:i w:val="1"/>
-                <w:iCs w:val="1"/>
-                <w:color w:val="548dd4"/>
-                <w:sz w:val="20"/>
-                <w:szCs w:val="20"/>
+                <w:rFonts w:ascii="Arial" w:cs="Arial" w:eastAsia="Arial" w:hAnsi="Arial"/>
+                <w:color w:val="1f3864"/>
               </w:rPr>
             </w:pPr>
             <w:r>
               <w:rPr>
-                <w:rFonts w:ascii="Calibri" w:cs="Calibri" w:eastAsia="Calibri" w:hAnsi="Calibri"/>
+                <w:rFonts w:ascii="Arial" w:cs="Arial" w:eastAsia="Arial" w:hAnsi="Arial"/>
                 <w:color w:val="1f3864"/>
                 <w:rtl w:val="0"/>
               </w:rPr>
@@ -2150,155 +3184,41 @@
             </w:r>
             <w:r>
               <w:rPr>
-                <w:rFonts w:ascii="Calibri" w:cs="Calibri" w:eastAsia="Calibri" w:hAnsi="Calibri"/>
-                <w:i w:val="1"/>
-                <w:iCs w:val="1"/>
-                <w:color w:val="548dd4"/>
-                <w:sz w:val="20"/>
-                <w:szCs w:val="20"/>
-                <w:rtl w:val="0"/>
-              </w:rPr>
-              <w:t xml:space="preserve">Señalar los ajustes que realizaste a tu plan de trabajo o actividades que eliminaste y, justifica por qué lo hiciste. </w:t>
-            </w:r>
-            <w:r>
-              <w:rPr>
-                <w:rtl w:val="0"/>
-              </w:rPr>
-              <w:t xml:space="preserve"> </w:t>
-            </w:r>
-            <w:r>
-              <w:rPr>
-                <w:rFonts w:ascii="Calibri" w:cs="Calibri" w:eastAsia="Calibri" w:hAnsi="Calibri"/>
-                <w:i w:val="1"/>
-                <w:iCs w:val="1"/>
-                <w:color w:val="548dd4"/>
-                <w:sz w:val="20"/>
-                <w:szCs w:val="20"/>
-                <w:rtl w:val="0"/>
-              </w:rPr>
-              <w:t xml:space="preserve">En el caso de que tu plan de trabajo no haya requerido ni requiera ajustes, justifica esta decisión a partir de los facilitadores que te han permitido desarrollarlo como fue planeado.</w:t>
+                <w:rtl w:val="0"/>
+              </w:rPr>
             </w:r>
           </w:p>
           <w:p>
             <w:pPr>
-              <w:jc w:val="both"/>
-              <w:rPr>
-                <w:rFonts w:ascii="Calibri" w:cs="Calibri" w:eastAsia="Calibri" w:hAnsi="Calibri"/>
-                <w:i w:val="1"/>
-                <w:iCs w:val="1"/>
-                <w:color w:val="548dd4"/>
-                <w:sz w:val="20"/>
-                <w:szCs w:val="20"/>
+              <w:spacing w:after="240" w:before="240" w:lineRule="auto"/>
+              <w:rPr>
+                <w:rFonts w:ascii="Arial" w:cs="Arial" w:eastAsia="Arial" w:hAnsi="Arial"/>
               </w:rPr>
             </w:pPr>
             <w:r>
               <w:rPr>
-                <w:rtl w:val="0"/>
-              </w:rPr>
+                <w:rFonts w:ascii="Arial" w:cs="Arial" w:eastAsia="Arial" w:hAnsi="Arial"/>
+                <w:rtl w:val="0"/>
+              </w:rPr>
+              <w:t xml:space="preserve">Durante el desarrollo del proyecto se realizaron ajustes en el modelo relacional y en la organización de usuarios, roles y solicitudes para mejorar la estructura del sistema.</w:t>
             </w:r>
           </w:p>
           <w:p>
             <w:pPr>
-              <w:jc w:val="both"/>
-              <w:rPr>
-                <w:rFonts w:ascii="Calibri" w:cs="Calibri" w:eastAsia="Calibri" w:hAnsi="Calibri"/>
+              <w:spacing w:after="240" w:before="240" w:lineRule="auto"/>
+              <w:rPr>
+                <w:rFonts w:ascii="Arial" w:cs="Arial" w:eastAsia="Arial" w:hAnsi="Arial"/>
                 <w:i w:val="1"/>
                 <w:iCs w:val="1"/>
-                <w:color w:val="c00000"/>
-                <w:sz w:val="20"/>
-                <w:szCs w:val="20"/>
               </w:rPr>
             </w:pPr>
             <w:r>
               <w:rPr>
-                <w:rtl w:val="0"/>
-              </w:rPr>
-            </w:r>
-          </w:p>
-          <w:p>
-            <w:pPr>
-              <w:jc w:val="both"/>
-              <w:rPr>
-                <w:rFonts w:ascii="Calibri" w:cs="Calibri" w:eastAsia="Calibri" w:hAnsi="Calibri"/>
-                <w:i w:val="1"/>
-                <w:iCs w:val="1"/>
-                <w:color w:val="548dd4"/>
-                <w:sz w:val="20"/>
-                <w:szCs w:val="20"/>
-              </w:rPr>
-            </w:pPr>
-            <w:r>
-              <w:rPr>
-                <w:rtl w:val="0"/>
-              </w:rPr>
-            </w:r>
-          </w:p>
-          <w:p>
-            <w:pPr>
-              <w:jc w:val="both"/>
-              <w:rPr>
-                <w:rFonts w:ascii="Calibri" w:cs="Calibri" w:eastAsia="Calibri" w:hAnsi="Calibri"/>
-                <w:i w:val="1"/>
-                <w:iCs w:val="1"/>
-                <w:color w:val="548dd4"/>
-                <w:sz w:val="20"/>
-                <w:szCs w:val="20"/>
-              </w:rPr>
-            </w:pPr>
-            <w:r>
-              <w:rPr>
-                <w:rtl w:val="0"/>
-              </w:rPr>
-            </w:r>
-          </w:p>
-          <w:p>
-            <w:pPr>
-              <w:jc w:val="both"/>
-              <w:rPr>
-                <w:rFonts w:ascii="Calibri" w:cs="Calibri" w:eastAsia="Calibri" w:hAnsi="Calibri"/>
-                <w:i w:val="1"/>
-                <w:iCs w:val="1"/>
-                <w:color w:val="548dd4"/>
-                <w:sz w:val="20"/>
-                <w:szCs w:val="20"/>
-              </w:rPr>
-            </w:pPr>
-            <w:r>
-              <w:rPr>
-                <w:rtl w:val="0"/>
-              </w:rPr>
-            </w:r>
-          </w:p>
-          <w:p>
-            <w:pPr>
-              <w:jc w:val="both"/>
-              <w:rPr>
-                <w:rFonts w:ascii="Calibri" w:cs="Calibri" w:eastAsia="Calibri" w:hAnsi="Calibri"/>
-                <w:i w:val="1"/>
-                <w:iCs w:val="1"/>
-                <w:color w:val="548dd4"/>
-                <w:sz w:val="20"/>
-                <w:szCs w:val="20"/>
-              </w:rPr>
-            </w:pPr>
-            <w:r>
-              <w:rPr>
-                <w:rtl w:val="0"/>
-              </w:rPr>
-            </w:r>
-          </w:p>
-          <w:p>
-            <w:pPr>
-              <w:jc w:val="both"/>
-              <w:rPr>
-                <w:rFonts w:ascii="Calibri" w:cs="Calibri" w:eastAsia="Calibri" w:hAnsi="Calibri"/>
-                <w:i w:val="1"/>
-                <w:iCs w:val="1"/>
-                <w:color w:val="548dd4"/>
-                <w:sz w:val="20"/>
-                <w:szCs w:val="20"/>
-              </w:rPr>
-            </w:pPr>
+                <w:rFonts w:ascii="Arial" w:cs="Arial" w:eastAsia="Arial" w:hAnsi="Arial"/>
+                <w:rtl w:val="0"/>
+              </w:rPr>
+              <w:t xml:space="preserve">Además, algunas funcionalidades fueron eliminadas y otras reemplazadas por módulos más relacionados con el objetivo principal del proyecto.</w:t>
+            </w:r>
             <w:r>
               <w:rPr>
                 <w:rtl w:val="0"/>
@@ -2313,7 +3233,7 @@
         <w:spacing w:after="0" w:line="240" w:lineRule="auto"/>
         <w:jc w:val="both"/>
         <w:rPr>
-          <w:rFonts w:ascii="Calibri" w:cs="Calibri" w:eastAsia="Calibri" w:hAnsi="Calibri"/>
+          <w:rFonts w:ascii="Arial" w:cs="Arial" w:eastAsia="Arial" w:hAnsi="Arial"/>
           <w:i w:val="1"/>
           <w:iCs w:val="1"/>
           <w:color w:val="548dd4"/>
@@ -2332,7 +3252,7 @@
         <w:spacing w:after="0" w:line="240" w:lineRule="auto"/>
         <w:jc w:val="both"/>
         <w:rPr>
-          <w:rFonts w:ascii="Calibri" w:cs="Calibri" w:eastAsia="Calibri" w:hAnsi="Calibri"/>
+          <w:rFonts w:ascii="Arial" w:cs="Arial" w:eastAsia="Arial" w:hAnsi="Arial"/>
           <w:i w:val="1"/>
           <w:iCs w:val="1"/>
           <w:color w:val="548dd4"/>
@@ -2385,7 +3305,7 @@
             <w:pPr>
               <w:jc w:val="both"/>
               <w:rPr>
-                <w:rFonts w:ascii="Calibri" w:cs="Calibri" w:eastAsia="Calibri" w:hAnsi="Calibri"/>
+                <w:rFonts w:ascii="Arial" w:cs="Arial" w:eastAsia="Arial" w:hAnsi="Arial"/>
                 <w:i w:val="1"/>
                 <w:iCs w:val="1"/>
                 <w:color w:val="548dd4"/>
@@ -2395,7 +3315,7 @@
             </w:pPr>
             <w:r>
               <w:rPr>
-                <w:rFonts w:ascii="Calibri" w:cs="Calibri" w:eastAsia="Calibri" w:hAnsi="Calibri"/>
+                <w:rFonts w:ascii="Arial" w:cs="Arial" w:eastAsia="Arial" w:hAnsi="Arial"/>
                 <w:color w:val="1f3864"/>
                 <w:rtl w:val="0"/>
               </w:rPr>
@@ -2403,7 +3323,7 @@
             </w:r>
             <w:r>
               <w:rPr>
-                <w:rFonts w:ascii="Calibri" w:cs="Calibri" w:eastAsia="Calibri" w:hAnsi="Calibri"/>
+                <w:rFonts w:ascii="Arial" w:cs="Arial" w:eastAsia="Arial" w:hAnsi="Arial"/>
                 <w:i w:val="1"/>
                 <w:iCs w:val="1"/>
                 <w:color w:val="548dd4"/>
@@ -2411,148 +3331,28 @@
                 <w:szCs w:val="20"/>
                 <w:rtl w:val="0"/>
               </w:rPr>
-              <w:t xml:space="preserve"> En caso de que </w:t>
-            </w:r>
-            <w:r>
-              <w:rPr>
-                <w:rFonts w:ascii="Calibri" w:cs="Calibri" w:eastAsia="Calibri" w:hAnsi="Calibri"/>
-                <w:b w:val="1"/>
-                <w:bCs w:val="1"/>
-                <w:i w:val="1"/>
-                <w:iCs w:val="1"/>
-                <w:color w:val="548dd4"/>
-                <w:sz w:val="20"/>
-                <w:szCs w:val="20"/>
-                <w:rtl w:val="0"/>
-              </w:rPr>
-              <w:t xml:space="preserve">no hayas iniciado actividades o estén retrasadas</w:t>
-            </w:r>
-            <w:r>
-              <w:rPr>
-                <w:rFonts w:ascii="Calibri" w:cs="Calibri" w:eastAsia="Calibri" w:hAnsi="Calibri"/>
-                <w:i w:val="1"/>
-                <w:iCs w:val="1"/>
-                <w:color w:val="548dd4"/>
-                <w:sz w:val="20"/>
-                <w:szCs w:val="20"/>
-                <w:rtl w:val="0"/>
-              </w:rPr>
-              <w:t xml:space="preserve"> de acuerdo a tu planificación, señala los motivos por los que no has podido cumplir dichos plazos y qué estrategias utilizarás para avanzar en dichas actividades y no afectar tu proyecto APT. </w:t>
+              <w:t xml:space="preserve"> </w:t>
+            </w:r>
+          </w:p>
+          <w:p>
+            <w:pPr>
+              <w:rPr>
+                <w:rFonts w:ascii="Arial" w:cs="Arial" w:eastAsia="Arial" w:hAnsi="Arial"/>
+              </w:rPr>
+            </w:pPr>
+            <w:r>
+              <w:rPr>
+                <w:rFonts w:ascii="Arial" w:cs="Arial" w:eastAsia="Arial" w:hAnsi="Arial"/>
+                <w:rtl w:val="0"/>
+              </w:rPr>
+              <w:t xml:space="preserve">Actualmente las actividades relacionadas con el desarrollo frontend y backend aún no han sido iniciadas completamente, debido a que el equipo se enfocó primero en la planificación, arquitectura y diseño de la base de datos del sistema. </w:t>
             </w:r>
           </w:p>
           <w:p>
             <w:pPr>
               <w:jc w:val="both"/>
               <w:rPr>
-                <w:rFonts w:ascii="Calibri" w:cs="Calibri" w:eastAsia="Calibri" w:hAnsi="Calibri"/>
-                <w:i w:val="1"/>
-                <w:iCs w:val="1"/>
-                <w:color w:val="548dd4"/>
-                <w:sz w:val="20"/>
-                <w:szCs w:val="20"/>
-              </w:rPr>
-            </w:pPr>
-            <w:r>
-              <w:rPr>
-                <w:rtl w:val="0"/>
-              </w:rPr>
-            </w:r>
-          </w:p>
-          <w:p>
-            <w:pPr>
-              <w:jc w:val="both"/>
-              <w:rPr>
-                <w:rFonts w:ascii="Calibri" w:cs="Calibri" w:eastAsia="Calibri" w:hAnsi="Calibri"/>
-                <w:i w:val="1"/>
-                <w:iCs w:val="1"/>
-                <w:color w:val="548dd4"/>
-                <w:sz w:val="20"/>
-                <w:szCs w:val="20"/>
-              </w:rPr>
-            </w:pPr>
-            <w:r>
-              <w:rPr>
-                <w:rtl w:val="0"/>
-              </w:rPr>
-            </w:r>
-          </w:p>
-          <w:p>
-            <w:pPr>
-              <w:jc w:val="both"/>
-              <w:rPr>
-                <w:rFonts w:ascii="Calibri" w:cs="Calibri" w:eastAsia="Calibri" w:hAnsi="Calibri"/>
-                <w:i w:val="1"/>
-                <w:iCs w:val="1"/>
-                <w:color w:val="548dd4"/>
-                <w:sz w:val="20"/>
-                <w:szCs w:val="20"/>
-              </w:rPr>
-            </w:pPr>
-            <w:r>
-              <w:rPr>
-                <w:rtl w:val="0"/>
-              </w:rPr>
-            </w:r>
-          </w:p>
-          <w:p>
-            <w:pPr>
-              <w:jc w:val="both"/>
-              <w:rPr>
-                <w:rFonts w:ascii="Calibri" w:cs="Calibri" w:eastAsia="Calibri" w:hAnsi="Calibri"/>
-                <w:i w:val="1"/>
-                <w:iCs w:val="1"/>
-                <w:color w:val="548dd4"/>
-                <w:sz w:val="20"/>
-                <w:szCs w:val="20"/>
-              </w:rPr>
-            </w:pPr>
-            <w:r>
-              <w:rPr>
-                <w:rtl w:val="0"/>
-              </w:rPr>
-            </w:r>
-          </w:p>
-          <w:p>
-            <w:pPr>
-              <w:jc w:val="both"/>
-              <w:rPr>
-                <w:rFonts w:ascii="Calibri" w:cs="Calibri" w:eastAsia="Calibri" w:hAnsi="Calibri"/>
-                <w:i w:val="1"/>
-                <w:iCs w:val="1"/>
-                <w:color w:val="548dd4"/>
-                <w:sz w:val="20"/>
-                <w:szCs w:val="20"/>
-              </w:rPr>
-            </w:pPr>
-            <w:r>
-              <w:rPr>
-                <w:rtl w:val="0"/>
-              </w:rPr>
-            </w:r>
-          </w:p>
-          <w:p>
-            <w:pPr>
-              <w:jc w:val="both"/>
-              <w:rPr>
-                <w:rFonts w:ascii="Calibri" w:cs="Calibri" w:eastAsia="Calibri" w:hAnsi="Calibri"/>
-                <w:i w:val="1"/>
-                <w:iCs w:val="1"/>
-                <w:color w:val="548dd4"/>
-                <w:sz w:val="20"/>
-                <w:szCs w:val="20"/>
-              </w:rPr>
-            </w:pPr>
-            <w:r>
-              <w:rPr>
-                <w:rtl w:val="0"/>
-              </w:rPr>
-            </w:r>
-          </w:p>
-          <w:p>
-            <w:pPr>
-              <w:jc w:val="both"/>
-              <w:rPr>
-                <w:rFonts w:ascii="Calibri" w:cs="Calibri" w:eastAsia="Calibri" w:hAnsi="Calibri"/>
+                <w:rFonts w:ascii="Arial" w:cs="Arial" w:eastAsia="Arial" w:hAnsi="Arial"/>
                 <w:i w:val="1"/>
                 <w:iCs w:val="1"/>
                 <w:color w:val="548dd4"/>
@@ -2580,7 +3380,7 @@
       </w:r>
     </w:p>
     <w:sectPr>
-      <w:headerReference r:id="rId9" w:type="default"/>
+      <w:headerReference r:id="rId14" w:type="default"/>
       <w:pgSz w:h="16838" w:w="11906" w:orient="portrait"/>
       <w:pgMar w:bottom="1417" w:top="1417" w:left="1701" w:right="1701" w:header="708" w:footer="708"/>
       <w:pgNumType w:start="1"/>
@@ -3516,7 +4316,7 @@
 
 <file path=customXML/item1.xml><?xml version="1.0" encoding="utf-8"?>
 <go:gDocsCustomXmlDataStorage xmlns:go="http://customooxmlschemas.google.com/" xmlns:r="http://schemas.openxmlformats.org/officeDocument/2006/relationships" uri="GoogleDocsCustomDataVersion2">
-  <go:docsCustomData xmlns:go="http://customooxmlschemas.google.com/" roundtripDataSignature="AMtx7mi3TYxBCy31mYQGDLr4RhDw4idlLw==">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</go:docsCustomData>
+  <go:docsCustomData xmlns:go="http://customooxmlschemas.google.com/" roundtripDataSignature="AMtx7mhTKx37/zLxsXdoYTvizBE9JSm4+A==">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</go:docsCustomData>
 </go:gDocsCustomXmlDataStorage>
 </file>
 

</xml_diff>